<commit_message>
chore: trim repository to core project files
</commit_message>
<xml_diff>
--- a/src/assets/template-merps.docx
+++ b/src/assets/template-merps.docx
@@ -1945,39 +1945,6 @@
         </w:rPr>
         <w:t xml:space="preserve"> Jam</w:t>
       </w:r>
-    </w:p>
-    <w:p>
-      <w:pPr>
-        <w:pStyle w:val="ListParagraph"/>
-        <w:spacing w:line="276" w:lineRule="auto"/>
-        <w:ind w:left="0" w:right="-246"/>
-        <w:jc w:val="both"/>
-        <w:rPr>
-          <w:bCs/>
-        </w:rPr>
-      </w:pPr>
-    </w:p>
-    <w:p>
-      <w:pPr>
-        <w:pStyle w:val="ListParagraph"/>
-        <w:spacing w:line="276" w:lineRule="auto"/>
-        <w:ind w:left="0" w:right="-246"/>
-        <w:jc w:val="both"/>
-        <w:rPr>
-          <w:bCs/>
-        </w:rPr>
-      </w:pPr>
-    </w:p>
-    <w:p>
-      <w:pPr>
-        <w:pStyle w:val="ListParagraph"/>
-        <w:spacing w:line="276" w:lineRule="auto"/>
-        <w:ind w:left="0" w:right="-246"/>
-        <w:jc w:val="both"/>
-        <w:rPr>
-          <w:bCs/>
-        </w:rPr>
-      </w:pPr>
     </w:p>
     <w:p>
       <w:pPr>

</xml_diff>

<commit_message>
feat: Finalize Si-RPS with AI generator, batch export ZIP, cleaned Word template, and fast RKPBM toolbar
</commit_message>
<xml_diff>
--- a/src/assets/template-merps.docx
+++ b/src/assets/template-merps.docx
@@ -1,6 +1,6 @@
 
 <file path=word/document.xml><?xml version="1.0" encoding="utf-8"?>
-<w:document xmlns:wpc="http://schemas.microsoft.com/office/word/2010/wordprocessingCanvas" xmlns:cx="http://schemas.microsoft.com/office/drawing/2014/chartex" xmlns:cx1="http://schemas.microsoft.com/office/drawing/2015/9/8/chartex" xmlns:cx2="http://schemas.microsoft.com/office/drawing/2015/10/21/chartex" xmlns:cx3="http://schemas.microsoft.com/office/drawing/2016/5/9/chartex" xmlns:cx4="http://schemas.microsoft.com/office/drawing/2016/5/10/chartex" xmlns:cx5="http://schemas.microsoft.com/office/drawing/2016/5/11/chartex" xmlns:cx6="http://schemas.microsoft.com/office/drawing/2016/5/12/chartex" xmlns:cx7="http://schemas.microsoft.com/office/drawing/2016/5/13/chartex" xmlns:cx8="http://schemas.microsoft.com/office/drawing/2016/5/14/chartex" xmlns:mc="http://schemas.openxmlformats.org/markup-compatibility/2006" xmlns:aink="http://schemas.microsoft.com/office/drawing/2016/ink" xmlns:am3d="http://schemas.microsoft.com/office/drawing/2017/model3d" xmlns:o="urn:schemas-microsoft-com:office:office" xmlns:oel="http://schemas.microsoft.com/office/2019/extlst" xmlns:r="http://schemas.openxmlformats.org/officeDocument/2006/relationships" xmlns:m="http://schemas.openxmlformats.org/officeDocument/2006/math" xmlns:v="urn:schemas-microsoft-com:vml" xmlns:wp14="http://schemas.microsoft.com/office/word/2010/wordprocessingDrawing" xmlns:wp="http://schemas.openxmlformats.org/drawingml/2006/wordprocessingDrawing" xmlns:w10="urn:schemas-microsoft-com:office:word" xmlns:w="http://schemas.openxmlformats.org/wordprocessingml/2006/main" xmlns:w14="http://schemas.microsoft.com/office/word/2010/wordml" xmlns:w15="http://schemas.microsoft.com/office/word/2012/wordml" xmlns:w16cex="http://schemas.microsoft.com/office/word/2018/wordml/cex" xmlns:w16cid="http://schemas.microsoft.com/office/word/2016/wordml/cid" xmlns:w16="http://schemas.microsoft.com/office/word/2018/wordml" xmlns:w16du="http://schemas.microsoft.com/office/word/2023/wordml/word16du" xmlns:w16sdtdh="http://schemas.microsoft.com/office/word/2020/wordml/sdtdatahash" xmlns:w16sdtfl="http://schemas.microsoft.com/office/word/2024/wordml/sdtformatlock" xmlns:w16se="http://schemas.microsoft.com/office/word/2015/wordml/symex" xmlns:wpg="http://schemas.microsoft.com/office/word/2010/wordprocessingGroup" xmlns:wpi="http://schemas.microsoft.com/office/word/2010/wordprocessingInk" xmlns:wne="http://schemas.microsoft.com/office/word/2006/wordml" xmlns:wps="http://schemas.microsoft.com/office/word/2010/wordprocessingShape" mc:Ignorable="w14 w15 w16se w16cid w16 w16cex w16sdtdh w16sdtfl w16du wp14">
+<w:document xmlns:wpc="http://schemas.microsoft.com/office/word/2010/wordprocessingCanvas" xmlns:cx="http://schemas.microsoft.com/office/drawing/2014/chartex" xmlns:cx1="http://schemas.microsoft.com/office/drawing/2015/9/8/chartex" xmlns:cx2="http://schemas.microsoft.com/office/drawing/2015/10/21/chartex" xmlns:cx3="http://schemas.microsoft.com/office/drawing/2016/5/9/chartex" xmlns:cx4="http://schemas.microsoft.com/office/drawing/2016/5/10/chartex" xmlns:cx5="http://schemas.microsoft.com/office/drawing/2016/5/11/chartex" xmlns:cx6="http://schemas.microsoft.com/office/drawing/2016/5/12/chartex" xmlns:cx7="http://schemas.microsoft.com/office/drawing/2016/5/13/chartex" xmlns:cx8="http://schemas.microsoft.com/office/drawing/2016/5/14/chartex" xmlns:mc="http://schemas.openxmlformats.org/markup-compatibility/2006" xmlns:aink="http://schemas.microsoft.com/office/drawing/2016/ink" xmlns:am3d="http://schemas.microsoft.com/office/drawing/2017/model3d" xmlns:o="urn:schemas-microsoft-com:office:office" xmlns:oel="http://schemas.microsoft.com/office/2019/extlst" xmlns:r="http://schemas.openxmlformats.org/officeDocument/2006/relationships" xmlns:m="http://schemas.openxmlformats.org/officeDocument/2006/math" xmlns:v="urn:schemas-microsoft-com:vml" xmlns:wp14="http://schemas.microsoft.com/office/word/2010/wordprocessingDrawing" xmlns:wp="http://schemas.openxmlformats.org/drawingml/2006/wordprocessingDrawing" xmlns:w10="urn:schemas-microsoft-com:office:word" xmlns:w="http://schemas.openxmlformats.org/wordprocessingml/2006/main" xmlns:w14="http://schemas.microsoft.com/office/word/2010/wordml" xmlns:w15="http://schemas.microsoft.com/office/word/2012/wordml" xmlns:w16cei="http://schemas.microsoft.com/office/word/2026/wordml/cei" xmlns:w16cex="http://schemas.microsoft.com/office/word/2018/wordml/cex" xmlns:w16cid="http://schemas.microsoft.com/office/word/2016/wordml/cid" xmlns:w16="http://schemas.microsoft.com/office/word/2018/wordml" xmlns:w16du="http://schemas.microsoft.com/office/word/2023/wordml/word16du" xmlns:w16sdtdh="http://schemas.microsoft.com/office/word/2020/wordml/sdtdatahash" xmlns:w16sdtfl="http://schemas.microsoft.com/office/word/2024/wordml/sdtformatlock" xmlns:w16se="http://schemas.microsoft.com/office/word/2015/wordml/symex" xmlns:wpg="http://schemas.microsoft.com/office/word/2010/wordprocessingGroup" xmlns:wpi="http://schemas.microsoft.com/office/word/2010/wordprocessingInk" xmlns:wne="http://schemas.microsoft.com/office/word/2006/wordml" xmlns:wps="http://schemas.microsoft.com/office/word/2010/wordprocessingShape" mc:Ignorable="w14 w15 w16se w16cid w16 w16cex w16sdtdh w16sdtfl w16du wp14">
   <w:body>
     <w:p>
       <w:pPr>
@@ -285,7 +285,25 @@
           <w:sz w:val="28"/>
           <w:szCs w:val="28"/>
         </w:rPr>
-        <w:t xml:space="preserve">{mata_kuliah_upper}</w:t>
+        <w:t>{</w:t>
+      </w:r>
+      <w:proofErr w:type="spellStart"/>
+      <w:r>
+        <w:rPr>
+          <w:b/>
+          <w:sz w:val="28"/>
+          <w:szCs w:val="28"/>
+        </w:rPr>
+        <w:t>mata_kuliah_upper</w:t>
+      </w:r>
+      <w:proofErr w:type="spellEnd"/>
+      <w:r>
+        <w:rPr>
+          <w:b/>
+          <w:sz w:val="28"/>
+          <w:szCs w:val="28"/>
+        </w:rPr>
+        <w:t>}</w:t>
       </w:r>
     </w:p>
     <w:p>
@@ -299,7 +317,7 @@
         </w:rPr>
       </w:pPr>
       <w:r>
-        <w:t xml:space="preserve">PROGRAM STUDI</w:t>
+        <w:t>PROGRAM STUDI</w:t>
       </w:r>
     </w:p>
     <w:p>
@@ -313,7 +331,15 @@
         </w:rPr>
       </w:pPr>
       <w:r>
-        <w:t xml:space="preserve">{prodi_upper}</w:t>
+        <w:t>{</w:t>
+      </w:r>
+      <w:proofErr w:type="spellStart"/>
+      <w:r>
+        <w:t>prodi_upper</w:t>
+      </w:r>
+      <w:proofErr w:type="spellEnd"/>
+      <w:r>
+        <w:t>}</w:t>
       </w:r>
     </w:p>
     <w:p>
@@ -385,7 +411,15 @@
         </w:rPr>
       </w:pPr>
       <w:r>
-        <w:t xml:space="preserve">{dosen_utama_nama}</w:t>
+        <w:t>{</w:t>
+      </w:r>
+      <w:proofErr w:type="spellStart"/>
+      <w:r>
+        <w:t>dosen_utama_nama</w:t>
+      </w:r>
+      <w:proofErr w:type="spellEnd"/>
+      <w:r>
+        <w:t>}</w:t>
       </w:r>
     </w:p>
     <w:p>
@@ -399,7 +433,15 @@
         </w:rPr>
       </w:pPr>
       <w:r>
-        <w:t xml:space="preserve">{dosen_utama_nomor}</w:t>
+        <w:t>{</w:t>
+      </w:r>
+      <w:proofErr w:type="spellStart"/>
+      <w:r>
+        <w:t>dosen_utama_nomor</w:t>
+      </w:r>
+      <w:proofErr w:type="spellEnd"/>
+      <w:r>
+        <w:t>}</w:t>
       </w:r>
     </w:p>
     <w:p>
@@ -456,54 +498,81 @@
           <w:szCs w:val="28"/>
           <w:lang w:val="id-ID"/>
         </w:rPr>
-        <w:t xml:space="preserve">JURUSAN {jurusan_upper}</w:t>
-      </w:r>
-      <w:r>
+        <w:t xml:space="preserve">JURUSAN {jurusan_upper} </w:t>
+      </w:r>
+    </w:p>
+    <w:p>
+      <w:pPr>
+        <w:spacing w:line="360" w:lineRule="auto"/>
+        <w:jc w:val="center"/>
         <w:rPr>
           <w:b/>
           <w:sz w:val="28"/>
           <w:szCs w:val="28"/>
-        </w:rPr>
-        <w:t xml:space="preserve"/>
-      </w:r>
-      <w:r>
+          <w:lang w:val="id-ID"/>
+        </w:rPr>
+      </w:pPr>
+      <w:r>
+        <w:t>{</w:t>
+      </w:r>
+      <w:proofErr w:type="spellStart"/>
+      <w:r>
+        <w:t>institusi_upper</w:t>
+      </w:r>
+      <w:proofErr w:type="spellEnd"/>
+      <w:r>
+        <w:t>}</w:t>
+      </w:r>
+    </w:p>
+    <w:p>
+      <w:pPr>
+        <w:spacing w:line="360" w:lineRule="auto"/>
+        <w:jc w:val="center"/>
         <w:rPr>
           <w:b/>
           <w:sz w:val="28"/>
           <w:szCs w:val="28"/>
-          <w:lang w:val="id-ID"/>
-        </w:rPr>
-        <w:t xml:space="preserve"> </w:t>
+        </w:rPr>
+      </w:pPr>
+      <w:r>
+        <w:t>{</w:t>
+      </w:r>
+      <w:proofErr w:type="spellStart"/>
+      <w:r>
+        <w:t>kota</w:t>
+      </w:r>
+      <w:proofErr w:type="spellEnd"/>
+      <w:r>
+        <w:t>}, {</w:t>
+      </w:r>
+      <w:proofErr w:type="spellStart"/>
+      <w:r>
+        <w:t>tanggal</w:t>
+      </w:r>
+      <w:proofErr w:type="spellEnd"/>
+      <w:r>
+        <w:t>}</w:t>
       </w:r>
     </w:p>
     <w:p>
       <w:pPr>
-        <w:spacing w:line="360" w:lineRule="auto"/>
+        <w:spacing w:line="276" w:lineRule="auto"/>
         <w:jc w:val="center"/>
         <w:rPr>
           <w:b/>
-          <w:sz w:val="28"/>
-          <w:szCs w:val="28"/>
-          <w:lang w:val="id-ID"/>
-        </w:rPr>
-      </w:pPr>
-      <w:r>
-        <w:t xml:space="preserve">{institusi_upper}</w:t>
-      </w:r>
+          <w:lang w:val="id-ID"/>
+        </w:rPr>
+      </w:pPr>
     </w:p>
     <w:p>
       <w:pPr>
-        <w:spacing w:line="360" w:lineRule="auto"/>
+        <w:spacing w:line="276" w:lineRule="auto"/>
         <w:jc w:val="center"/>
         <w:rPr>
           <w:b/>
-          <w:sz w:val="28"/>
-          <w:szCs w:val="28"/>
-        </w:rPr>
-      </w:pPr>
-      <w:r>
-        <w:t xml:space="preserve">{kota}, {tanggal}</w:t>
-      </w:r>
+          <w:lang w:val="id-ID"/>
+        </w:rPr>
+      </w:pPr>
     </w:p>
     <w:p>
       <w:pPr>
@@ -514,36 +583,12 @@
           <w:lang w:val="id-ID"/>
         </w:rPr>
       </w:pPr>
-    </w:p>
-    <w:p>
-      <w:pPr>
-        <w:spacing w:line="276" w:lineRule="auto"/>
-        <w:jc w:val="center"/>
-        <w:rPr>
-          <w:b/>
-          <w:lang w:val="id-ID"/>
-        </w:rPr>
-      </w:pPr>
-      <w:r>
-        <w:rPr>
-          <w:b/>
-          <w:lang w:val="id-ID"/>
-        </w:rPr>
-        <w:t xml:space="preserve">RENCANA PEMBELAJARAN </w:t>
-      </w:r>
-      <w:r>
-        <w:rPr>
-          <w:b/>
-          <w:lang w:val="id-ID"/>
-        </w:rPr>
-        <w:t xml:space="preserve"/>
-      </w:r>
-      <w:r>
-        <w:rPr>
-          <w:b/>
-          <w:lang w:val="id-ID"/>
-        </w:rPr>
-        <w:t xml:space="preserve">SEMESTER (RPS)</w:t>
+      <w:r>
+        <w:rPr>
+          <w:b/>
+          <w:lang w:val="id-ID"/>
+        </w:rPr>
+        <w:t>RENCANA PEMBELAJARAN SEMESTER (RPS)</w:t>
       </w:r>
     </w:p>
     <w:p>
@@ -596,7 +641,7 @@
         <w:rPr>
           <w:lang w:val="id-ID"/>
         </w:rPr>
-        <w:t xml:space="preserve">Mata Kuliah</w:t>
+        <w:t>Mata Kuliah</w:t>
       </w:r>
       <w:r>
         <w:rPr>
@@ -612,7 +657,15 @@
         <w:t xml:space="preserve">: </w:t>
       </w:r>
       <w:r>
-        <w:t xml:space="preserve">{mata_kuliah}</w:t>
+        <w:t>{</w:t>
+      </w:r>
+      <w:proofErr w:type="spellStart"/>
+      <w:r>
+        <w:t>mata_kuliah</w:t>
+      </w:r>
+      <w:proofErr w:type="spellEnd"/>
+      <w:r>
+        <w:t>}</w:t>
       </w:r>
     </w:p>
     <w:p>
@@ -628,13 +681,13 @@
         <w:rPr>
           <w:lang w:val="id-ID"/>
         </w:rPr>
-        <w:t xml:space="preserve">Kode Mata Kulia</w:t>
-      </w:r>
-      <w:r>
-        <w:rPr>
-          <w:lang w:val="id-ID"/>
-        </w:rPr>
-        <w:t xml:space="preserve">h</w:t>
+        <w:t>Kode Mata Kulia</w:t>
+      </w:r>
+      <w:r>
+        <w:rPr>
+          <w:lang w:val="id-ID"/>
+        </w:rPr>
+        <w:t>h</w:t>
       </w:r>
       <w:r>
         <w:rPr>
@@ -654,14 +707,23 @@
           <w:sz w:val="20"/>
           <w:szCs w:val="20"/>
         </w:rPr>
-        <w:t xml:space="preserve">{kode_mk}</w:t>
-      </w:r>
+        <w:t>{</w:t>
+      </w:r>
+      <w:proofErr w:type="spellStart"/>
       <w:r>
         <w:rPr>
           <w:sz w:val="20"/>
           <w:szCs w:val="20"/>
         </w:rPr>
-        <w:t xml:space="preserve"/>
+        <w:t>kode_mk</w:t>
+      </w:r>
+      <w:proofErr w:type="spellEnd"/>
+      <w:r>
+        <w:rPr>
+          <w:sz w:val="20"/>
+          <w:szCs w:val="20"/>
+        </w:rPr>
+        <w:t>}</w:t>
       </w:r>
       <w:r>
         <w:rPr>
@@ -680,7 +742,7 @@
         <w:rPr>
           <w:lang w:val="id-ID"/>
         </w:rPr>
-        <w:t xml:space="preserve">SKS/ Jam per minggu</w:t>
+        <w:t>SKS/ Jam per minggu</w:t>
       </w:r>
       <w:r>
         <w:rPr>
@@ -690,16 +752,23 @@
         <w:t xml:space="preserve">: </w:t>
       </w:r>
       <w:r>
-        <w:t xml:space="preserve">{sks} / {jam_per_minggu}</w:t>
-      </w:r>
-      <w:r>
-        <w:rPr>
-          <w:lang w:val="id-ID"/>
-        </w:rPr>
-        <w:t xml:space="preserve"/>
-      </w:r>
-      <w:r>
-        <w:t xml:space="preserve"/>
+        <w:t>{</w:t>
+      </w:r>
+      <w:proofErr w:type="spellStart"/>
+      <w:r>
+        <w:t>sks</w:t>
+      </w:r>
+      <w:proofErr w:type="spellEnd"/>
+      <w:r>
+        <w:t>} / {</w:t>
+      </w:r>
+      <w:proofErr w:type="spellStart"/>
+      <w:r>
+        <w:t>jam_per_minggu</w:t>
+      </w:r>
+      <w:proofErr w:type="spellEnd"/>
+      <w:r>
+        <w:t>}</w:t>
       </w:r>
     </w:p>
     <w:p>
@@ -715,7 +784,7 @@
         <w:rPr>
           <w:lang w:val="id-ID"/>
         </w:rPr>
-        <w:t xml:space="preserve">Semester</w:t>
+        <w:t>Semester</w:t>
       </w:r>
       <w:r>
         <w:rPr>
@@ -740,37 +809,7 @@
         <w:rPr>
           <w:lang w:val="id-ID"/>
         </w:rPr>
-        <w:t xml:space="preserve">{semester_kelas}</w:t>
-      </w:r>
-      <w:r>
-        <w:t xml:space="preserve"/>
-      </w:r>
-      <w:r>
-        <w:rPr>
-          <w:lang w:val="id-ID"/>
-        </w:rPr>
-        <w:t xml:space="preserve"/>
-      </w:r>
-      <w:r>
-        <w:t xml:space="preserve"/>
-      </w:r>
-      <w:r>
-        <w:t xml:space="preserve"/>
-      </w:r>
-      <w:r>
-        <w:t xml:space="preserve"/>
-      </w:r>
-      <w:r>
-        <w:t xml:space="preserve"/>
-      </w:r>
-      <w:r>
-        <w:t xml:space="preserve"/>
-      </w:r>
-      <w:r>
-        <w:rPr>
-          <w:lang w:val="id-ID"/>
-        </w:rPr>
-        <w:t xml:space="preserve"/>
+        <w:t>{semester_kelas}</w:t>
       </w:r>
     </w:p>
     <w:p>
@@ -786,7 +825,7 @@
         <w:rPr>
           <w:lang w:val="id-ID"/>
         </w:rPr>
-        <w:t xml:space="preserve">Pra Syarat</w:t>
+        <w:t>Pra Syarat</w:t>
       </w:r>
       <w:r>
         <w:rPr>
@@ -808,7 +847,15 @@
         <w:t xml:space="preserve">: </w:t>
       </w:r>
       <w:r>
-        <w:t xml:space="preserve">{prasyarat}</w:t>
+        <w:t>{</w:t>
+      </w:r>
+      <w:proofErr w:type="spellStart"/>
+      <w:r>
+        <w:t>prasyarat</w:t>
+      </w:r>
+      <w:proofErr w:type="spellEnd"/>
+      <w:r>
+        <w:t>}</w:t>
       </w:r>
     </w:p>
     <w:p>
@@ -821,7 +868,7 @@
         <w:rPr>
           <w:lang w:val="id-ID"/>
         </w:rPr>
-        <w:t xml:space="preserve">Dosen Pengampu</w:t>
+        <w:t>Dosen Pengampu</w:t>
       </w:r>
       <w:r>
         <w:rPr>
@@ -840,46 +887,21 @@
         <w:rPr>
           <w:b/>
         </w:rPr>
-        <w:t xml:space="preserve">{dosen_utama_nama}</w:t>
-      </w:r>
-      <w:r>
-        <w:rPr>
-          <w:b/>
-          <w:lang w:val="id-ID"/>
-        </w:rPr>
-        <w:t xml:space="preserve"/>
-      </w:r>
-      <w:r>
-        <w:rPr>
-          <w:b/>
-          <w:lang w:val="id-ID"/>
-        </w:rPr>
-        <w:t xml:space="preserve"/>
-      </w:r>
-      <w:r>
-        <w:rPr>
-          <w:b/>
-        </w:rPr>
-        <w:t xml:space="preserve"/>
-      </w:r>
-      <w:r>
-        <w:rPr>
-          <w:b/>
-          <w:lang w:val="id-ID"/>
-        </w:rPr>
-        <w:t xml:space="preserve"/>
-      </w:r>
-      <w:r>
-        <w:rPr>
-          <w:b/>
-        </w:rPr>
-        <w:t xml:space="preserve"/>
-      </w:r>
-      <w:r>
-        <w:rPr>
-          <w:b/>
-        </w:rPr>
-        <w:t xml:space="preserve"/>
+        <w:t>{</w:t>
+      </w:r>
+      <w:proofErr w:type="spellStart"/>
+      <w:r>
+        <w:rPr>
+          <w:b/>
+        </w:rPr>
+        <w:t>dosen_utama_nama</w:t>
+      </w:r>
+      <w:proofErr w:type="spellEnd"/>
+      <w:r>
+        <w:rPr>
+          <w:b/>
+        </w:rPr>
+        <w:t>}</w:t>
       </w:r>
     </w:p>
     <w:p>
@@ -895,7 +917,7 @@
         <w:rPr>
           <w:lang w:val="id-ID"/>
         </w:rPr>
-        <w:t xml:space="preserve">Perkiraan Jumlah Peserta</w:t>
+        <w:t>Perkiraan Jumlah Peserta</w:t>
       </w:r>
       <w:r>
         <w:rPr>
@@ -905,31 +927,15 @@
         <w:t xml:space="preserve">: </w:t>
       </w:r>
       <w:r>
-        <w:t xml:space="preserve">{perkiraan_peserta}</w:t>
-      </w:r>
-      <w:r>
-        <w:t xml:space="preserve"/>
-      </w:r>
-      <w:r>
-        <w:rPr>
-          <w:lang w:val="id-ID"/>
-        </w:rPr>
-        <w:t xml:space="preserve"/>
-      </w:r>
-      <w:r>
-        <w:t xml:space="preserve"/>
-      </w:r>
-      <w:r>
-        <w:rPr>
-          <w:lang w:val="id-ID"/>
-        </w:rPr>
-        <w:t xml:space="preserve"/>
-      </w:r>
-      <w:r>
-        <w:rPr>
-          <w:lang w:val="id-ID"/>
-        </w:rPr>
-        <w:t xml:space="preserve"/>
+        <w:t>{</w:t>
+      </w:r>
+      <w:proofErr w:type="spellStart"/>
+      <w:r>
+        <w:t>perkiraan_peserta</w:t>
+      </w:r>
+      <w:proofErr w:type="spellEnd"/>
+      <w:r>
+        <w:t>}</w:t>
       </w:r>
     </w:p>
     <w:p>
@@ -972,7 +978,7 @@
           <w:b/>
           <w:lang w:val="id-ID"/>
         </w:rPr>
-        <w:t>DEKSRIPSI SINGKAT MATA KULIAH</w:t>
+        <w:t>DESKRIPSI SINGKAT MATA KULIAH</w:t>
       </w:r>
     </w:p>
     <w:p>
@@ -983,7 +989,15 @@
         <w:jc w:val="both"/>
       </w:pPr>
       <w:r>
-        <w:t xml:space="preserve">{deskripsi_singkat}</w:t>
+        <w:t>{</w:t>
+      </w:r>
+      <w:proofErr w:type="spellStart"/>
+      <w:r>
+        <w:t>deskripsi_singkat</w:t>
+      </w:r>
+      <w:proofErr w:type="spellEnd"/>
+      <w:r>
+        <w:t>}</w:t>
       </w:r>
     </w:p>
     <w:p>
@@ -1030,7 +1044,15 @@
         <w:jc w:val="both"/>
       </w:pPr>
       <w:r>
-        <w:t xml:space="preserve">{tujuan_umum}</w:t>
+        <w:t>{</w:t>
+      </w:r>
+      <w:proofErr w:type="spellStart"/>
+      <w:r>
+        <w:t>tujuan_umum</w:t>
+      </w:r>
+      <w:proofErr w:type="spellEnd"/>
+      <w:r>
+        <w:t>}</w:t>
       </w:r>
     </w:p>
     <w:p>
@@ -1078,7 +1100,7 @@
     </w:p>
     <w:p>
       <w:r>
-        <w:t xml:space="preserve">{#tujuan_khusus}</w:t>
+        <w:t>{#tujuan_khusus}</w:t>
       </w:r>
     </w:p>
     <w:p>
@@ -1097,12 +1119,28 @@
         </w:rPr>
       </w:pPr>
       <w:r>
-        <w:t xml:space="preserve">{teks}</w:t>
+        <w:t>{</w:t>
+      </w:r>
+      <w:proofErr w:type="spellStart"/>
+      <w:r>
+        <w:t>teks</w:t>
+      </w:r>
+      <w:proofErr w:type="spellEnd"/>
+      <w:r>
+        <w:t>}</w:t>
       </w:r>
     </w:p>
     <w:p>
       <w:r>
-        <w:t xml:space="preserve">{/tujuan_khusus}</w:t>
+        <w:t>{/</w:t>
+      </w:r>
+      <w:proofErr w:type="spellStart"/>
+      <w:r>
+        <w:t>tujuan_khusus</w:t>
+      </w:r>
+      <w:proofErr w:type="spellEnd"/>
+      <w:r>
+        <w:t>}</w:t>
       </w:r>
     </w:p>
     <w:p>
@@ -1176,7 +1214,7 @@
           <w:bCs/>
           <w:lang w:val="id-ID"/>
         </w:rPr>
-        <w:t xml:space="preserve">(Q&amp;A)</w:t>
+        <w:t>(Q&amp;A)</w:t>
       </w:r>
       <w:r>
         <w:rPr>
@@ -1217,7 +1255,21 @@
         <w:rPr>
           <w:bCs/>
         </w:rPr>
-        <w:t xml:space="preserve">{perkuliahan_jam} Jam</w:t>
+        <w:t>{</w:t>
+      </w:r>
+      <w:proofErr w:type="spellStart"/>
+      <w:r>
+        <w:rPr>
+          <w:bCs/>
+        </w:rPr>
+        <w:t>perkuliahan_jam</w:t>
+      </w:r>
+      <w:proofErr w:type="spellEnd"/>
+      <w:r>
+        <w:rPr>
+          <w:bCs/>
+        </w:rPr>
+        <w:t>} Jam</w:t>
       </w:r>
       <w:r>
         <w:rPr>
@@ -1246,20 +1298,7 @@
           <w:bCs/>
           <w:lang w:val="id-ID"/>
         </w:rPr>
-        <w:t xml:space="preserve">({perkuliahan_minggu} minggu)</w:t>
-      </w:r>
-      <w:r>
-        <w:rPr>
-          <w:bCs/>
-        </w:rPr>
-        <w:t xml:space="preserve"/>
-      </w:r>
-      <w:r>
-        <w:rPr>
-          <w:bCs/>
-          <w:lang w:val="id-ID"/>
-        </w:rPr>
-        <w:t xml:space="preserve"/>
+        <w:t>({perkuliahan_minggu} minggu)</w:t>
       </w:r>
     </w:p>
     <w:p>
@@ -1282,18 +1321,26 @@
           <w:bCs/>
           <w:lang w:val="id-ID"/>
         </w:rPr>
-        <w:t xml:space="preserve">Jam Latihan Soal</w:t>
+        <w:t>Jam Latihan Soal</w:t>
       </w:r>
       <w:r>
         <w:rPr>
           <w:bCs/>
         </w:rPr>
-        <w:t xml:space="preserve"> dan Kuis</w:t>
-      </w:r>
+        <w:t xml:space="preserve"> dan </w:t>
+      </w:r>
+      <w:proofErr w:type="spellStart"/>
       <w:r>
         <w:rPr>
           <w:bCs/>
         </w:rPr>
+        <w:t>Kuis</w:t>
+      </w:r>
+      <w:proofErr w:type="spellEnd"/>
+      <w:r>
+        <w:rPr>
+          <w:bCs/>
+        </w:rPr>
         <w:tab/>
       </w:r>
       <w:r>
@@ -1332,11 +1379,25 @@
         <w:rPr>
           <w:bCs/>
         </w:rPr>
-        <w:t xml:space="preserve">{latihan_jam} Jam</w:t>
-      </w:r>
+        <w:t>{</w:t>
+      </w:r>
+      <w:proofErr w:type="spellStart"/>
       <w:r>
         <w:rPr>
           <w:bCs/>
+        </w:rPr>
+        <w:t>latihan_jam</w:t>
+      </w:r>
+      <w:proofErr w:type="spellEnd"/>
+      <w:r>
+        <w:rPr>
+          <w:bCs/>
+        </w:rPr>
+        <w:t>} Jam</w:t>
+      </w:r>
+      <w:r>
+        <w:rPr>
+          <w:bCs/>
           <w:lang w:val="id-ID"/>
         </w:rPr>
         <w:t xml:space="preserve">   </w:t>
@@ -1347,20 +1408,7 @@
           <w:lang w:val="id-ID"/>
         </w:rPr>
         <w:tab/>
-        <w:t xml:space="preserve">=  ({latihan_minggu} minggu)</w:t>
-      </w:r>
-      <w:r>
-        <w:rPr>
-          <w:bCs/>
-        </w:rPr>
-        <w:t xml:space="preserve"/>
-      </w:r>
-      <w:r>
-        <w:rPr>
-          <w:bCs/>
-          <w:lang w:val="id-ID"/>
-        </w:rPr>
-        <w:t xml:space="preserve"/>
+        <w:t>=  ({latihan_minggu} minggu)</w:t>
       </w:r>
     </w:p>
     <w:p>
@@ -1378,12 +1426,14 @@
           <w:lang w:val="id-ID"/>
         </w:rPr>
       </w:pPr>
+      <w:proofErr w:type="spellStart"/>
       <w:r>
         <w:rPr>
           <w:bCs/>
         </w:rPr>
-        <w:t xml:space="preserve">Praktikum</w:t>
-      </w:r>
+        <w:t>Praktikum</w:t>
+      </w:r>
+      <w:proofErr w:type="spellEnd"/>
       <w:r>
         <w:rPr>
           <w:bCs/>
@@ -1413,7 +1463,7 @@
           <w:bCs/>
         </w:rPr>
         <w:tab/>
-        <w:t xml:space="preserve">=</w:t>
+        <w:t>=</w:t>
       </w:r>
       <w:r>
         <w:rPr>
@@ -1425,18 +1475,26 @@
         <w:rPr>
           <w:bCs/>
         </w:rPr>
-        <w:t xml:space="preserve">{praktikum_jam} Jam</w:t>
-      </w:r>
+        <w:t>{</w:t>
+      </w:r>
+      <w:proofErr w:type="spellStart"/>
       <w:r>
         <w:rPr>
           <w:bCs/>
         </w:rPr>
-        <w:t xml:space="preserve"/>
-      </w:r>
+        <w:t>praktikum_jam</w:t>
+      </w:r>
+      <w:proofErr w:type="spellEnd"/>
       <w:r>
         <w:rPr>
           <w:bCs/>
         </w:rPr>
+        <w:t>} Jam</w:t>
+      </w:r>
+      <w:r>
+        <w:rPr>
+          <w:bCs/>
+        </w:rPr>
         <w:t xml:space="preserve"> </w:t>
       </w:r>
       <w:r>
@@ -1444,19 +1502,48 @@
           <w:bCs/>
         </w:rPr>
         <w:tab/>
-        <w:t xml:space="preserve">=  ({praktikum_minggu} minggu)</w:t>
-      </w:r>
+      </w:r>
+      <w:proofErr w:type="gramStart"/>
       <w:r>
         <w:rPr>
           <w:bCs/>
         </w:rPr>
-        <w:t xml:space="preserve"/>
-      </w:r>
+        <w:t>=  (</w:t>
+      </w:r>
+      <w:proofErr w:type="gramEnd"/>
       <w:r>
         <w:rPr>
           <w:bCs/>
         </w:rPr>
-        <w:t xml:space="preserve"/>
+        <w:t>{</w:t>
+      </w:r>
+      <w:proofErr w:type="spellStart"/>
+      <w:r>
+        <w:rPr>
+          <w:bCs/>
+        </w:rPr>
+        <w:t>praktikum_minggu</w:t>
+      </w:r>
+      <w:proofErr w:type="spellEnd"/>
+      <w:r>
+        <w:rPr>
+          <w:bCs/>
+        </w:rPr>
+        <w:t xml:space="preserve">} </w:t>
+      </w:r>
+      <w:proofErr w:type="spellStart"/>
+      <w:r>
+        <w:rPr>
+          <w:bCs/>
+        </w:rPr>
+        <w:t>minggu</w:t>
+      </w:r>
+      <w:proofErr w:type="spellEnd"/>
+      <w:r>
+        <w:rPr>
+          <w:bCs/>
+        </w:rPr>
+        <w:t>)</w:t>
       </w:r>
     </w:p>
     <w:p>
@@ -1731,7 +1818,7 @@
           <w:bCs/>
           <w:lang w:val="id-ID"/>
         </w:rPr>
-        <w:t xml:space="preserve">Ujian Tengah dan Akhir Semester</w:t>
+        <w:t>Ujian Tengah dan Akhir Semester</w:t>
       </w:r>
       <w:r>
         <w:rPr>
@@ -1746,7 +1833,7 @@
           <w:lang w:val="id-ID"/>
         </w:rPr>
         <w:tab/>
-        <w:t xml:space="preserve">=</w:t>
+        <w:t>=</w:t>
       </w:r>
       <w:r>
         <w:rPr>
@@ -1780,7 +1867,7 @@
           <w:bCs/>
           <w:lang w:val="id-ID"/>
         </w:rPr>
-        <w:t xml:space="preserve">=</w:t>
+        <w:t>=</w:t>
       </w:r>
       <w:r>
         <w:rPr>
@@ -1794,22 +1881,23 @@
           <w:b/>
           <w:bCs/>
         </w:rPr>
-        <w:t xml:space="preserve">{total_jam} Jam</w:t>
-      </w:r>
+        <w:t>{</w:t>
+      </w:r>
+      <w:proofErr w:type="spellStart"/>
       <w:r>
         <w:rPr>
           <w:b/>
           <w:bCs/>
         </w:rPr>
-        <w:t xml:space="preserve"/>
-      </w:r>
+        <w:t>total_jam</w:t>
+      </w:r>
+      <w:proofErr w:type="spellEnd"/>
       <w:r>
         <w:rPr>
           <w:b/>
           <w:bCs/>
-          <w:lang w:val="id-ID"/>
-        </w:rPr>
-        <w:t xml:space="preserve"/>
+        </w:rPr>
+        <w:t>} Jam</w:t>
       </w:r>
       <w:r>
         <w:rPr>
@@ -1922,6 +2010,7 @@
         </w:rPr>
         <w:t>(</w:t>
       </w:r>
+      <w:proofErr w:type="spellStart"/>
       <w:r>
         <w:rPr>
           <w:bCs/>
@@ -1929,6 +2018,7 @@
         </w:rPr>
         <w:t>Empat</w:t>
       </w:r>
+      <w:proofErr w:type="spellEnd"/>
       <w:r>
         <w:rPr>
           <w:bCs/>
@@ -1977,7 +2067,6 @@
           <w:b/>
           <w:lang w:val="id-ID"/>
         </w:rPr>
-        <w:lastRenderedPageBreak/>
         <w:t>DAFTAR BUKU BACAAN</w:t>
       </w:r>
       <w:r>
@@ -1996,20 +2085,17 @@
     <w:p>
       <w:pPr>
         <w:pStyle w:val="BodyTextIndent3"/>
+        <w:numPr>
+          <w:ilvl w:val="0"/>
+          <w:numId w:val="42"/>
+        </w:numPr>
         <w:spacing w:line="240" w:lineRule="auto"/>
-        <w:rPr>
-          <w:b/>
-          <w:color w:val="FF0000"/>
-          <w:lang w:val="id-ID"/>
-        </w:rPr>
-      </w:pPr>
-      <w:r>
-        <w:rPr>
-          <w:b/>
-          <w:lang w:val="id-ID"/>
-        </w:rPr>
-        <w:t xml:space="preserve">a. </w:t>
-      </w:r>
+        <w:ind w:left="360"/>
+        <w:rPr>
+          <w:b/>
+          <w:lang w:val="id-ID"/>
+        </w:rPr>
+      </w:pPr>
       <w:r>
         <w:rPr>
           <w:b/>
@@ -2020,7 +2106,7 @@
     </w:p>
     <w:p>
       <w:r>
-        <w:t xml:space="preserve">{#buku_utama}</w:t>
+        <w:t>{#buku_utama}</w:t>
       </w:r>
     </w:p>
     <w:p>
@@ -2040,25 +2126,71 @@
         </w:rPr>
       </w:pPr>
       <w:r>
-        <w:t xml:space="preserve">{teks}</w:t>
+        <w:t>{</w:t>
+      </w:r>
+      <w:proofErr w:type="spellStart"/>
+      <w:r>
+        <w:t>teks</w:t>
+      </w:r>
+      <w:proofErr w:type="spellEnd"/>
+      <w:r>
+        <w:t>}</w:t>
       </w:r>
     </w:p>
     <w:p>
       <w:r>
-        <w:t xml:space="preserve">{/buku_utama}</w:t>
+        <w:t>{/</w:t>
+      </w:r>
+      <w:proofErr w:type="spellStart"/>
+      <w:r>
+        <w:t>buku_utama</w:t>
+      </w:r>
+      <w:proofErr w:type="spellEnd"/>
+      <w:r>
+        <w:t>}</w:t>
       </w:r>
     </w:p>
     <w:p>
-      <w:r>
-        <w:rPr>
-          <w:b/>
-        </w:rPr>
-        <w:t xml:space="preserve">b. Buku Pendukung:</w:t>
+      <w:pPr>
+        <w:pStyle w:val="ListParagraph"/>
+        <w:numPr>
+          <w:ilvl w:val="0"/>
+          <w:numId w:val="42"/>
+        </w:numPr>
+        <w:ind w:left="360"/>
+      </w:pPr>
+      <w:proofErr w:type="spellStart"/>
+      <w:r>
+        <w:rPr>
+          <w:b/>
+        </w:rPr>
+        <w:t>Buku</w:t>
+      </w:r>
+      <w:proofErr w:type="spellEnd"/>
+      <w:r>
+        <w:rPr>
+          <w:b/>
+        </w:rPr>
+        <w:t xml:space="preserve"> </w:t>
+      </w:r>
+      <w:proofErr w:type="spellStart"/>
+      <w:r>
+        <w:rPr>
+          <w:b/>
+        </w:rPr>
+        <w:t>Pendukung</w:t>
+      </w:r>
+      <w:proofErr w:type="spellEnd"/>
+      <w:r>
+        <w:rPr>
+          <w:b/>
+        </w:rPr>
+        <w:t>:</w:t>
       </w:r>
     </w:p>
     <w:p>
       <w:r>
-        <w:t xml:space="preserve">{#buku_pendukung}</w:t>
+        <w:t>{#buku_pendukung}</w:t>
       </w:r>
     </w:p>
     <w:p>
@@ -2078,13 +2210,38 @@
         </w:rPr>
       </w:pPr>
       <w:r>
-        <w:t xml:space="preserve">{teks}</w:t>
+        <w:t>{</w:t>
+      </w:r>
+      <w:proofErr w:type="spellStart"/>
+      <w:r>
+        <w:t>teks</w:t>
+      </w:r>
+      <w:proofErr w:type="spellEnd"/>
+      <w:r>
+        <w:t>}</w:t>
       </w:r>
     </w:p>
     <w:p>
       <w:r>
-        <w:t xml:space="preserve">{/buku_pendukung}</w:t>
-      </w:r>
+        <w:t>{/</w:t>
+      </w:r>
+      <w:proofErr w:type="spellStart"/>
+      <w:r>
+        <w:t>buku_pendukung</w:t>
+      </w:r>
+      <w:proofErr w:type="spellEnd"/>
+      <w:r>
+        <w:t>}</w:t>
+      </w:r>
+    </w:p>
+    <w:p>
+      <w:pPr>
+        <w:spacing w:line="276" w:lineRule="auto"/>
+        <w:rPr>
+          <w:sz w:val="18"/>
+          <w:lang w:val="id-ID"/>
+        </w:rPr>
+      </w:pPr>
     </w:p>
     <w:p>
       <w:pPr>
@@ -2134,14 +2291,14 @@
         <w:rPr>
           <w:lang w:val="id-ID"/>
         </w:rPr>
-        <w:t xml:space="preserve">Ujian Tengah Semester</w:t>
+        <w:t>Ujian Tengah Semester</w:t>
       </w:r>
       <w:r>
         <w:rPr>
           <w:lang w:val="id-ID"/>
         </w:rPr>
         <w:tab/>
-        <w:t xml:space="preserve">(NM)</w:t>
+        <w:t>(NM)</w:t>
       </w:r>
       <w:r>
         <w:rPr>
@@ -2162,13 +2319,15 @@
         <w:t xml:space="preserve">= </w:t>
       </w:r>
       <w:r>
-        <w:t xml:space="preserve">{uts} %</w:t>
-      </w:r>
-      <w:r>
-        <w:rPr>
-          <w:lang w:val="id-ID"/>
-        </w:rPr>
-        <w:t xml:space="preserve"/>
+        <w:t>{</w:t>
+      </w:r>
+      <w:proofErr w:type="spellStart"/>
+      <w:r>
+        <w:t>uts</w:t>
+      </w:r>
+      <w:proofErr w:type="spellEnd"/>
+      <w:r>
+        <w:t>} %</w:t>
       </w:r>
       <w:r>
         <w:rPr>
@@ -2195,7 +2354,7 @@
         <w:rPr>
           <w:lang w:val="id-ID"/>
         </w:rPr>
-        <w:t xml:space="preserve">Ujian Akhir Semester (NA)</w:t>
+        <w:t>Ujian Akhir Semester (NA)</w:t>
       </w:r>
       <w:r>
         <w:rPr>
@@ -2216,13 +2375,15 @@
         <w:t xml:space="preserve">= </w:t>
       </w:r>
       <w:r>
-        <w:t xml:space="preserve">{uas} %</w:t>
-      </w:r>
-      <w:r>
-        <w:rPr>
-          <w:lang w:val="id-ID"/>
-        </w:rPr>
-        <w:t xml:space="preserve"/>
+        <w:t>{</w:t>
+      </w:r>
+      <w:proofErr w:type="spellStart"/>
+      <w:r>
+        <w:t>uas</w:t>
+      </w:r>
+      <w:proofErr w:type="spellEnd"/>
+      <w:r>
+        <w:t>} %</w:t>
       </w:r>
     </w:p>
     <w:p>
@@ -2243,16 +2404,16 @@
         <w:rPr>
           <w:lang w:val="id-ID"/>
         </w:rPr>
-        <w:t xml:space="preserve">Nilai Kegiatan Perkuli</w:t>
-      </w:r>
-      <w:r>
-        <w:t xml:space="preserve">a</w:t>
-      </w:r>
-      <w:r>
-        <w:rPr>
-          <w:lang w:val="id-ID"/>
-        </w:rPr>
-        <w:t xml:space="preserve">han (NKP)</w:t>
+        <w:t>Nilai Kegiatan Perkuli</w:t>
+      </w:r>
+      <w:r>
+        <w:t>a</w:t>
+      </w:r>
+      <w:r>
+        <w:rPr>
+          <w:lang w:val="id-ID"/>
+        </w:rPr>
+        <w:t>han (NKP)</w:t>
       </w:r>
       <w:r>
         <w:t xml:space="preserve"> </w:t>
@@ -2262,10 +2423,15 @@
         <w:t xml:space="preserve">= </w:t>
       </w:r>
       <w:r>
-        <w:t xml:space="preserve">{nkp} %</w:t>
-      </w:r>
-      <w:r>
-        <w:t xml:space="preserve"/>
+        <w:t>{</w:t>
+      </w:r>
+      <w:proofErr w:type="spellStart"/>
+      <w:r>
+        <w:t>nkp</w:t>
+      </w:r>
+      <w:proofErr w:type="spellEnd"/>
+      <w:r>
+        <w:t>} %</w:t>
       </w:r>
     </w:p>
     <w:p>
@@ -2275,14 +2441,12 @@
         <w:ind w:left="3600" w:firstLine="720"/>
         <w:rPr>
           <w:b/>
-          <w:u w:val="single"/>
-          <w:lang w:val="id-ID"/>
-        </w:rPr>
-      </w:pPr>
-      <w:r>
-        <w:rPr>
-          <w:b/>
-          <w:u w:val="single"/>
+          <w:lang w:val="id-ID"/>
+        </w:rPr>
+      </w:pPr>
+      <w:r>
+        <w:rPr>
+          <w:b/>
           <w:lang w:val="id-ID"/>
         </w:rPr>
         <w:t xml:space="preserve">= </w:t>
@@ -2290,14 +2454,12 @@
       <w:r>
         <w:rPr>
           <w:b/>
-          <w:u w:val="single"/>
         </w:rPr>
         <w:t>90</w:t>
       </w:r>
       <w:r>
         <w:rPr>
           <w:b/>
-          <w:u w:val="single"/>
           <w:lang w:val="id-ID"/>
         </w:rPr>
         <w:t xml:space="preserve"> %</w:t>
@@ -2321,11 +2483,13 @@
         <w:rPr>
           <w:lang w:val="id-ID"/>
         </w:rPr>
-        <w:t xml:space="preserve">Nilai Kegiatan P</w:t>
-      </w:r>
-      <w:r>
-        <w:t xml:space="preserve">raktikum</w:t>
-      </w:r>
+        <w:t>Nilai Kegiatan P</w:t>
+      </w:r>
+      <w:proofErr w:type="spellStart"/>
+      <w:r>
+        <w:t>raktikum</w:t>
+      </w:r>
+      <w:proofErr w:type="spellEnd"/>
       <w:r>
         <w:rPr>
           <w:lang w:val="id-ID"/>
@@ -2333,13 +2497,13 @@
         <w:t xml:space="preserve"> (NKP</w:t>
       </w:r>
       <w:r>
-        <w:t xml:space="preserve">r</w:t>
-      </w:r>
-      <w:r>
-        <w:rPr>
-          <w:lang w:val="id-ID"/>
-        </w:rPr>
-        <w:t xml:space="preserve">)</w:t>
+        <w:t>r</w:t>
+      </w:r>
+      <w:r>
+        <w:rPr>
+          <w:lang w:val="id-ID"/>
+        </w:rPr>
+        <w:t>)</w:t>
       </w:r>
       <w:r>
         <w:rPr>
@@ -2351,7 +2515,6 @@
       <w:r>
         <w:rPr>
           <w:b/>
-          <w:u w:val="single"/>
           <w:lang w:val="id-ID"/>
         </w:rPr>
         <w:t xml:space="preserve">= </w:t>
@@ -2359,17 +2522,22 @@
       <w:r>
         <w:rPr>
           <w:b/>
-          <w:u w:val="single"/>
-        </w:rPr>
-        <w:t xml:space="preserve">{nkpr} %</w:t>
-      </w:r>
-      <w:r>
-        <w:rPr>
-          <w:b/>
-          <w:u w:val="single"/>
-          <w:lang w:val="id-ID"/>
-        </w:rPr>
-        <w:t xml:space="preserve"/>
+        </w:rPr>
+        <w:t>{</w:t>
+      </w:r>
+      <w:proofErr w:type="spellStart"/>
+      <w:r>
+        <w:rPr>
+          <w:b/>
+        </w:rPr>
+        <w:t>nkpr</w:t>
+      </w:r>
+      <w:proofErr w:type="spellEnd"/>
+      <w:r>
+        <w:rPr>
+          <w:b/>
+        </w:rPr>
+        <w:t>} %</w:t>
       </w:r>
     </w:p>
     <w:p>
@@ -2521,7 +2689,6 @@
         <w:ind w:left="284"/>
         <w:rPr>
           <w:b/>
-          <w:color w:val="FF0000"/>
           <w:sz w:val="2"/>
           <w:lang w:val="id-ID"/>
         </w:rPr>
@@ -2635,7 +2802,7 @@
     <w:tbl>
       <w:tblPr>
         <w:tblW w:w="0" w:type="auto"/>
-        <w:tblInd w:w="675" w:type="dxa"/>
+        <w:tblInd w:w="425" w:type="dxa"/>
         <w:tblBorders>
           <w:top w:val="single" w:sz="4" w:space="0" w:color="000000"/>
           <w:left w:val="single" w:sz="4" w:space="0" w:color="000000"/>
@@ -2648,7 +2815,7 @@
       </w:tblPr>
       <w:tblGrid>
         <w:gridCol w:w="2673"/>
-        <w:gridCol w:w="1522"/>
+        <w:gridCol w:w="1943"/>
         <w:gridCol w:w="1560"/>
         <w:gridCol w:w="1560"/>
       </w:tblGrid>
@@ -2792,13 +2959,15 @@
                 <w:szCs w:val="22"/>
               </w:rPr>
             </w:pPr>
-            <w:r>
-              <w:rPr>
-                <w:sz w:val="22"/>
-                <w:szCs w:val="22"/>
-              </w:rPr>
-              <w:t xml:space="preserve">Sikap</w:t>
-            </w:r>
+            <w:proofErr w:type="spellStart"/>
+            <w:r>
+              <w:rPr>
+                <w:sz w:val="22"/>
+                <w:szCs w:val="22"/>
+              </w:rPr>
+              <w:t>Sikap</w:t>
+            </w:r>
+            <w:proofErr w:type="spellEnd"/>
           </w:p>
         </w:tc>
         <w:tc>
@@ -2825,15 +2994,23 @@
                 <w:sz w:val="22"/>
                 <w:szCs w:val="22"/>
               </w:rPr>
-              <w:t xml:space="preserve">{hbh_sikap}</w:t>
-            </w:r>
-            <w:r>
-              <w:rPr>
-                <w:sz w:val="22"/>
-                <w:szCs w:val="22"/>
-                <w:lang w:val="id-ID"/>
-              </w:rPr>
-              <w:t xml:space="preserve"/>
+              <w:t>{</w:t>
+            </w:r>
+            <w:proofErr w:type="spellStart"/>
+            <w:r>
+              <w:rPr>
+                <w:sz w:val="22"/>
+                <w:szCs w:val="22"/>
+              </w:rPr>
+              <w:t>hbh_sikap</w:t>
+            </w:r>
+            <w:proofErr w:type="spellEnd"/>
+            <w:r>
+              <w:rPr>
+                <w:sz w:val="22"/>
+                <w:szCs w:val="22"/>
+              </w:rPr>
+              <w:t>}</w:t>
             </w:r>
           </w:p>
         </w:tc>
@@ -2877,7 +3054,7 @@
                 <w:szCs w:val="22"/>
                 <w:lang w:val="id-ID"/>
               </w:rPr>
-              <w:t xml:space="preserve">A</w:t>
+              <w:t>A</w:t>
             </w:r>
           </w:p>
         </w:tc>
@@ -2904,7 +3081,7 @@
                 <w:szCs w:val="22"/>
                 <w:lang w:val="id-ID"/>
               </w:rPr>
-              <w:t xml:space="preserve">Latihan dan Kuis</w:t>
+              <w:t>Latihan dan Kuis</w:t>
             </w:r>
           </w:p>
         </w:tc>
@@ -2931,7 +3108,23 @@
                 <w:sz w:val="22"/>
                 <w:szCs w:val="22"/>
               </w:rPr>
-              <w:t xml:space="preserve">{hbh_latihan_kuis}</w:t>
+              <w:t>{</w:t>
+            </w:r>
+            <w:proofErr w:type="spellStart"/>
+            <w:r>
+              <w:rPr>
+                <w:sz w:val="22"/>
+                <w:szCs w:val="22"/>
+              </w:rPr>
+              <w:t>hbh_latihan_kuis</w:t>
+            </w:r>
+            <w:proofErr w:type="spellEnd"/>
+            <w:r>
+              <w:rPr>
+                <w:sz w:val="22"/>
+                <w:szCs w:val="22"/>
+              </w:rPr>
+              <w:t>}</w:t>
             </w:r>
           </w:p>
         </w:tc>
@@ -2975,7 +3168,7 @@
                 <w:szCs w:val="22"/>
                 <w:lang w:val="id-ID"/>
               </w:rPr>
-              <w:t xml:space="preserve">B</w:t>
+              <w:t>B</w:t>
             </w:r>
           </w:p>
         </w:tc>
@@ -3029,7 +3222,23 @@
                 <w:sz w:val="22"/>
                 <w:szCs w:val="22"/>
               </w:rPr>
-              <w:t xml:space="preserve">{hbh_tugas}</w:t>
+              <w:t>{</w:t>
+            </w:r>
+            <w:proofErr w:type="spellStart"/>
+            <w:r>
+              <w:rPr>
+                <w:sz w:val="22"/>
+                <w:szCs w:val="22"/>
+              </w:rPr>
+              <w:t>hbh_tugas</w:t>
+            </w:r>
+            <w:proofErr w:type="spellEnd"/>
+            <w:r>
+              <w:rPr>
+                <w:sz w:val="22"/>
+                <w:szCs w:val="22"/>
+              </w:rPr>
+              <w:t>}</w:t>
             </w:r>
           </w:p>
         </w:tc>
@@ -3073,7 +3282,7 @@
                 <w:szCs w:val="22"/>
                 <w:lang w:val="id-ID"/>
               </w:rPr>
-              <w:t xml:space="preserve">C</w:t>
+              <w:t>C</w:t>
             </w:r>
           </w:p>
         </w:tc>
@@ -3222,7 +3431,6 @@
       </w:r>
       <w:r>
         <w:rPr>
-          <w:u w:val="single"/>
           <w:lang w:val="id-ID"/>
         </w:rPr>
         <w:t xml:space="preserve">A + B + C </w:t>
@@ -3500,7 +3708,7 @@
     <w:tbl>
       <w:tblPr>
         <w:tblW w:w="5765" w:type="dxa"/>
-        <w:tblInd w:w="959" w:type="dxa"/>
+        <w:tblInd w:w="425" w:type="dxa"/>
         <w:tblBorders>
           <w:top w:val="single" w:sz="4" w:space="0" w:color="000000"/>
           <w:left w:val="single" w:sz="4" w:space="0" w:color="000000"/>
@@ -3512,10 +3720,10 @@
         <w:tblLook w:val="04A0" w:firstRow="1" w:lastRow="0" w:firstColumn="1" w:lastColumn="0" w:noHBand="0" w:noVBand="1"/>
       </w:tblPr>
       <w:tblGrid>
-        <w:gridCol w:w="595"/>
-        <w:gridCol w:w="2665"/>
-        <w:gridCol w:w="1276"/>
-        <w:gridCol w:w="1229"/>
+        <w:gridCol w:w="553"/>
+        <w:gridCol w:w="2157"/>
+        <w:gridCol w:w="2041"/>
+        <w:gridCol w:w="1014"/>
       </w:tblGrid>
       <w:tr>
         <w:tc>
@@ -3662,7 +3870,7 @@
                 <w:szCs w:val="22"/>
                 <w:lang w:val="id-ID"/>
               </w:rPr>
-              <w:t xml:space="preserve">1</w:t>
+              <w:t>1</w:t>
             </w:r>
           </w:p>
         </w:tc>
@@ -3687,7 +3895,7 @@
                 <w:szCs w:val="22"/>
                 <w:lang w:val="id-ID"/>
               </w:rPr>
-              <w:t xml:space="preserve">Kerapian</w:t>
+              <w:t>Kerapian</w:t>
             </w:r>
           </w:p>
         </w:tc>
@@ -3711,7 +3919,23 @@
                 <w:sz w:val="22"/>
                 <w:szCs w:val="22"/>
               </w:rPr>
-              <w:t xml:space="preserve">{etika_kerapian}</w:t>
+              <w:t>{</w:t>
+            </w:r>
+            <w:proofErr w:type="spellStart"/>
+            <w:r>
+              <w:rPr>
+                <w:sz w:val="22"/>
+                <w:szCs w:val="22"/>
+              </w:rPr>
+              <w:t>etika_kerapian</w:t>
+            </w:r>
+            <w:proofErr w:type="spellEnd"/>
+            <w:r>
+              <w:rPr>
+                <w:sz w:val="22"/>
+                <w:szCs w:val="22"/>
+              </w:rPr>
+              <w:t>}</w:t>
             </w:r>
           </w:p>
         </w:tc>
@@ -3735,7 +3959,7 @@
                 <w:sz w:val="22"/>
                 <w:szCs w:val="22"/>
               </w:rPr>
-              <w:t xml:space="preserve">A</w:t>
+              <w:t>A</w:t>
             </w:r>
           </w:p>
         </w:tc>
@@ -3763,7 +3987,7 @@
                 <w:szCs w:val="22"/>
                 <w:lang w:val="id-ID"/>
               </w:rPr>
-              <w:t xml:space="preserve">2</w:t>
+              <w:t>2</w:t>
             </w:r>
           </w:p>
         </w:tc>
@@ -3788,7 +4012,7 @@
                 <w:szCs w:val="22"/>
                 <w:lang w:val="id-ID"/>
               </w:rPr>
-              <w:t xml:space="preserve">Kerja Sama</w:t>
+              <w:t>Kerja Sama</w:t>
             </w:r>
           </w:p>
         </w:tc>
@@ -3813,7 +4037,23 @@
                 <w:sz w:val="22"/>
                 <w:szCs w:val="22"/>
               </w:rPr>
-              <w:t xml:space="preserve">{etika_kerja_sama}</w:t>
+              <w:t>{</w:t>
+            </w:r>
+            <w:proofErr w:type="spellStart"/>
+            <w:r>
+              <w:rPr>
+                <w:sz w:val="22"/>
+                <w:szCs w:val="22"/>
+              </w:rPr>
+              <w:t>etika_kerja_sama</w:t>
+            </w:r>
+            <w:proofErr w:type="spellEnd"/>
+            <w:r>
+              <w:rPr>
+                <w:sz w:val="22"/>
+                <w:szCs w:val="22"/>
+              </w:rPr>
+              <w:t>}</w:t>
             </w:r>
           </w:p>
         </w:tc>
@@ -3837,7 +4077,7 @@
                 <w:sz w:val="22"/>
                 <w:szCs w:val="22"/>
               </w:rPr>
-              <w:t xml:space="preserve">A</w:t>
+              <w:t>A</w:t>
             </w:r>
           </w:p>
         </w:tc>
@@ -3865,7 +4105,7 @@
                 <w:szCs w:val="22"/>
                 <w:lang w:val="id-ID"/>
               </w:rPr>
-              <w:t xml:space="preserve">3</w:t>
+              <w:t>3</w:t>
             </w:r>
           </w:p>
         </w:tc>
@@ -3890,7 +4130,7 @@
                 <w:szCs w:val="22"/>
                 <w:lang w:val="id-ID"/>
               </w:rPr>
-              <w:t xml:space="preserve">Kedisiplinan</w:t>
+              <w:t>Kedisiplinan</w:t>
             </w:r>
           </w:p>
         </w:tc>
@@ -3915,7 +4155,23 @@
                 <w:sz w:val="22"/>
                 <w:szCs w:val="22"/>
               </w:rPr>
-              <w:t xml:space="preserve">{etika_kedisiplinan}</w:t>
+              <w:t>{</w:t>
+            </w:r>
+            <w:proofErr w:type="spellStart"/>
+            <w:r>
+              <w:rPr>
+                <w:sz w:val="22"/>
+                <w:szCs w:val="22"/>
+              </w:rPr>
+              <w:t>etika_kedisiplinan</w:t>
+            </w:r>
+            <w:proofErr w:type="spellEnd"/>
+            <w:r>
+              <w:rPr>
+                <w:sz w:val="22"/>
+                <w:szCs w:val="22"/>
+              </w:rPr>
+              <w:t>}</w:t>
             </w:r>
           </w:p>
         </w:tc>
@@ -3939,7 +4195,7 @@
                 <w:sz w:val="22"/>
                 <w:szCs w:val="22"/>
               </w:rPr>
-              <w:t xml:space="preserve">A</w:t>
+              <w:t>A</w:t>
             </w:r>
           </w:p>
         </w:tc>
@@ -3967,7 +4223,7 @@
                 <w:szCs w:val="22"/>
                 <w:lang w:val="id-ID"/>
               </w:rPr>
-              <w:t xml:space="preserve">4</w:t>
+              <w:t>4</w:t>
             </w:r>
           </w:p>
         </w:tc>
@@ -3992,7 +4248,7 @@
                 <w:szCs w:val="22"/>
                 <w:lang w:val="id-ID"/>
               </w:rPr>
-              <w:t xml:space="preserve">Ketelitian</w:t>
+              <w:t>Ketelitian</w:t>
             </w:r>
           </w:p>
         </w:tc>
@@ -4017,7 +4273,23 @@
                 <w:sz w:val="22"/>
                 <w:szCs w:val="22"/>
               </w:rPr>
-              <w:t xml:space="preserve">{etika_ketelitian}</w:t>
+              <w:t>{</w:t>
+            </w:r>
+            <w:proofErr w:type="spellStart"/>
+            <w:r>
+              <w:rPr>
+                <w:sz w:val="22"/>
+                <w:szCs w:val="22"/>
+              </w:rPr>
+              <w:t>etika_ketelitian</w:t>
+            </w:r>
+            <w:proofErr w:type="spellEnd"/>
+            <w:r>
+              <w:rPr>
+                <w:sz w:val="22"/>
+                <w:szCs w:val="22"/>
+              </w:rPr>
+              <w:t>}</w:t>
             </w:r>
           </w:p>
         </w:tc>
@@ -4041,7 +4313,7 @@
                 <w:sz w:val="22"/>
                 <w:szCs w:val="22"/>
               </w:rPr>
-              <w:t xml:space="preserve">A</w:t>
+              <w:t>A</w:t>
             </w:r>
           </w:p>
         </w:tc>
@@ -4220,7 +4492,7 @@
     <w:tbl>
       <w:tblPr>
         <w:tblW w:w="7513" w:type="dxa"/>
-        <w:tblInd w:w="675" w:type="dxa"/>
+        <w:tblInd w:w="425" w:type="dxa"/>
         <w:tblBorders>
           <w:top w:val="single" w:sz="4" w:space="0" w:color="000000"/>
           <w:left w:val="single" w:sz="4" w:space="0" w:color="000000"/>
@@ -4393,7 +4665,7 @@
                 <w:szCs w:val="22"/>
                 <w:lang w:val="id-ID"/>
               </w:rPr>
-              <w:t xml:space="preserve">Essay Test</w:t>
+              <w:t>Essay Test</w:t>
             </w:r>
             <w:r>
               <w:rPr>
@@ -4427,7 +4699,7 @@
                 <w:szCs w:val="22"/>
                 <w:lang w:val="id-ID"/>
               </w:rPr>
-              <w:t xml:space="preserve">Relatif</w:t>
+              <w:t>Relatif</w:t>
             </w:r>
           </w:p>
         </w:tc>
@@ -4453,15 +4725,7 @@
                 <w:szCs w:val="22"/>
                 <w:lang w:val="id-ID"/>
               </w:rPr>
-              <w:t xml:space="preserve">{uts}</w:t>
-            </w:r>
-            <w:r>
-              <w:rPr>
-                <w:sz w:val="22"/>
-                <w:szCs w:val="22"/>
-                <w:lang w:val="id-ID"/>
-              </w:rPr>
-              <w:t xml:space="preserve"/>
+              <w:t>{uts}</w:t>
             </w:r>
           </w:p>
         </w:tc>
@@ -4485,7 +4749,7 @@
                 <w:sz w:val="22"/>
                 <w:szCs w:val="22"/>
               </w:rPr>
-              <w:t xml:space="preserve">A</w:t>
+              <w:t>A</w:t>
             </w:r>
           </w:p>
         </w:tc>
@@ -4514,7 +4778,7 @@
                 <w:szCs w:val="22"/>
                 <w:lang w:val="id-ID"/>
               </w:rPr>
-              <w:t xml:space="preserve">Essay Test</w:t>
+              <w:t>Essay Test</w:t>
             </w:r>
             <w:r>
               <w:rPr>
@@ -4548,7 +4812,7 @@
                 <w:szCs w:val="22"/>
                 <w:lang w:val="id-ID"/>
               </w:rPr>
-              <w:t xml:space="preserve">Relatif</w:t>
+              <w:t>Relatif</w:t>
             </w:r>
           </w:p>
         </w:tc>
@@ -4573,15 +4837,23 @@
                 <w:sz w:val="22"/>
                 <w:szCs w:val="22"/>
               </w:rPr>
-              <w:t xml:space="preserve">{uas}</w:t>
-            </w:r>
-            <w:r>
-              <w:rPr>
-                <w:sz w:val="22"/>
-                <w:szCs w:val="22"/>
-                <w:lang w:val="id-ID"/>
-              </w:rPr>
-              <w:t xml:space="preserve"/>
+              <w:t>{</w:t>
+            </w:r>
+            <w:proofErr w:type="spellStart"/>
+            <w:r>
+              <w:rPr>
+                <w:sz w:val="22"/>
+                <w:szCs w:val="22"/>
+              </w:rPr>
+              <w:t>uas</w:t>
+            </w:r>
+            <w:proofErr w:type="spellEnd"/>
+            <w:r>
+              <w:rPr>
+                <w:sz w:val="22"/>
+                <w:szCs w:val="22"/>
+              </w:rPr>
+              <w:t>}</w:t>
             </w:r>
           </w:p>
         </w:tc>
@@ -4605,7 +4877,7 @@
                 <w:sz w:val="22"/>
                 <w:szCs w:val="22"/>
               </w:rPr>
-              <w:t xml:space="preserve">A</w:t>
+              <w:t>A</w:t>
             </w:r>
           </w:p>
         </w:tc>
@@ -4716,7 +4988,6 @@
           <w:b/>
           <w:lang w:val="id-ID"/>
         </w:rPr>
-        <w:lastRenderedPageBreak/>
         <w:t>Komponen P</w:t>
       </w:r>
       <w:r>
@@ -4790,7 +5061,7 @@
           <w:numId w:val="11"/>
         </w:numPr>
         <w:spacing w:line="360" w:lineRule="auto"/>
-        <w:ind w:hanging="654"/>
+        <w:ind w:left="425"/>
         <w:jc w:val="both"/>
         <w:rPr>
           <w:b/>
@@ -4804,6 +5075,7 @@
         </w:rPr>
         <w:t xml:space="preserve"> </w:t>
       </w:r>
+      <w:proofErr w:type="gramStart"/>
       <w:r>
         <w:rPr>
           <w:b/>
@@ -4815,14 +5087,31 @@
           <w:b/>
           <w:lang w:val="id-ID"/>
         </w:rPr>
-        <w:t xml:space="preserve">  SKS Teori</w:t>
-      </w:r>
-      <w:r>
-        <w:rPr>
-          <w:b/>
-        </w:rPr>
-        <w:t xml:space="preserve"> dan Praktek</w:t>
-      </w:r>
+        <w:t xml:space="preserve">  SKS</w:t>
+      </w:r>
+      <w:proofErr w:type="gramEnd"/>
+      <w:r>
+        <w:rPr>
+          <w:b/>
+          <w:lang w:val="id-ID"/>
+        </w:rPr>
+        <w:t xml:space="preserve"> Teori</w:t>
+      </w:r>
+      <w:r>
+        <w:rPr>
+          <w:b/>
+        </w:rPr>
+        <w:t xml:space="preserve"> dan </w:t>
+      </w:r>
+      <w:proofErr w:type="spellStart"/>
+      <w:proofErr w:type="gramStart"/>
+      <w:r>
+        <w:rPr>
+          <w:b/>
+        </w:rPr>
+        <w:t>Praktek</w:t>
+      </w:r>
+      <w:proofErr w:type="spellEnd"/>
       <w:r>
         <w:rPr>
           <w:b/>
@@ -4834,20 +5123,34 @@
         <w:rPr>
           <w:lang w:val="id-ID"/>
         </w:rPr>
-        <w:t xml:space="preserve">Penilaian berdasarkan: </w:t>
+        <w:t>Penilaian</w:t>
+      </w:r>
+      <w:proofErr w:type="gramEnd"/>
+      <w:r>
+        <w:rPr>
+          <w:lang w:val="id-ID"/>
+        </w:rPr>
+        <w:t xml:space="preserve"> berdasarkan: </w:t>
       </w:r>
       <w:r>
         <w:t xml:space="preserve">Absen, </w:t>
       </w:r>
+      <w:proofErr w:type="spellStart"/>
       <w:r>
         <w:t>Tugas</w:t>
       </w:r>
-      <w:r>
-        <w:t>, K</w:t>
+      <w:proofErr w:type="spellEnd"/>
+      <w:r>
+        <w:t xml:space="preserve">, </w:t>
+      </w:r>
+      <w:proofErr w:type="spellStart"/>
+      <w:r>
+        <w:t>K</w:t>
       </w:r>
       <w:r>
         <w:t>uis</w:t>
       </w:r>
+      <w:proofErr w:type="spellEnd"/>
       <w:r>
         <w:t xml:space="preserve"> dan Etika </w:t>
       </w:r>
@@ -4912,7 +5215,15 @@
         <w:t>%</w:t>
       </w:r>
       <w:r>
-        <w:t xml:space="preserve"> dan Praktikum = </w:t>
+        <w:t xml:space="preserve"> dan </w:t>
+      </w:r>
+      <w:proofErr w:type="spellStart"/>
+      <w:r>
+        <w:t>Praktikum</w:t>
+      </w:r>
+      <w:proofErr w:type="spellEnd"/>
+      <w:r>
+        <w:t xml:space="preserve"> = </w:t>
       </w:r>
       <w:r>
         <w:t xml:space="preserve">10 </w:t>
@@ -4955,7 +5266,6 @@
           <w:b/>
           <w:lang w:val="id-ID"/>
         </w:rPr>
-        <w:lastRenderedPageBreak/>
         <w:t>RENCANA KEGIATAN PEMBELAJARAN MINGGUAN (RKPBM)</w:t>
       </w:r>
     </w:p>
@@ -4978,18 +5288,11 @@
         <w:gridCol w:w="1008"/>
         <w:gridCol w:w="3960"/>
         <w:gridCol w:w="3945"/>
-        <w:gridCol w:w="2513"/>
-        <w:gridCol w:w="7"/>
+        <w:gridCol w:w="2520"/>
         <w:gridCol w:w="1800"/>
         <w:gridCol w:w="1965"/>
       </w:tblGrid>
       <w:tr>
-        <w:tblPrEx>
-          <w:tblCellMar>
-            <w:top w:w="0" w:type="dxa"/>
-            <w:bottom w:w="0" w:type="dxa"/>
-          </w:tblCellMar>
-        </w:tblPrEx>
         <w:trPr>
           <w:cantSplit/>
           <w:trHeight w:val="1257"/>
@@ -5081,7 +5384,6 @@
         <w:tc>
           <w:tcPr>
             <w:tcW w:w="2520" w:type="dxa"/>
-            <w:gridSpan w:val="2"/>
             <w:tcBorders>
               <w:bottom w:val="single" w:sz="4" w:space="0" w:color="auto"/>
             </w:tcBorders>
@@ -5197,7 +5499,23 @@
           </w:tcPr>
           <w:p>
             <w:r>
-              <w:t xml:space="preserve">{#rkpbm}{^ujian}{minggu}</w:t>
+              <w:t>{#</w:t>
+            </w:r>
+            <w:proofErr w:type="gramStart"/>
+            <w:r>
+              <w:t>rkpbm}{</w:t>
+            </w:r>
+            <w:proofErr w:type="gramEnd"/>
+            <w:r>
+              <w:t>^</w:t>
+            </w:r>
+            <w:proofErr w:type="gramStart"/>
+            <w:r>
+              <w:t>ujian}{</w:t>
+            </w:r>
+            <w:proofErr w:type="gramEnd"/>
+            <w:r>
+              <w:t>minggu}</w:t>
             </w:r>
           </w:p>
         </w:tc>
@@ -5210,7 +5528,15 @@
           </w:tcPr>
           <w:p>
             <w:r>
-              <w:t xml:space="preserve">{tujuan}</w:t>
+              <w:t>{</w:t>
+            </w:r>
+            <w:proofErr w:type="spellStart"/>
+            <w:r>
+              <w:t>tujuan</w:t>
+            </w:r>
+            <w:proofErr w:type="spellEnd"/>
+            <w:r>
+              <w:t>}</w:t>
             </w:r>
           </w:p>
         </w:tc>
@@ -5223,21 +5549,36 @@
           </w:tcPr>
           <w:p>
             <w:r>
-              <w:t xml:space="preserve">{pokok}</w:t>
+              <w:t>{</w:t>
+            </w:r>
+            <w:proofErr w:type="spellStart"/>
+            <w:r>
+              <w:t>pokok</w:t>
+            </w:r>
+            <w:proofErr w:type="spellEnd"/>
+            <w:r>
+              <w:t>}</w:t>
             </w:r>
           </w:p>
         </w:tc>
         <w:tc>
           <w:tcPr>
             <w:tcW w:w="2520" w:type="dxa"/>
-            <w:gridSpan w:val="2"/>
             <w:tcBorders>
               <w:bottom w:val="single" w:sz="4" w:space="0" w:color="auto"/>
             </w:tcBorders>
           </w:tcPr>
           <w:p>
             <w:r>
-              <w:t xml:space="preserve">{metoda}</w:t>
+              <w:t>{</w:t>
+            </w:r>
+            <w:proofErr w:type="spellStart"/>
+            <w:r>
+              <w:t>metoda</w:t>
+            </w:r>
+            <w:proofErr w:type="spellEnd"/>
+            <w:r>
+              <w:t>}</w:t>
             </w:r>
           </w:p>
         </w:tc>
@@ -5250,7 +5591,15 @@
           </w:tcPr>
           <w:p>
             <w:r>
-              <w:t xml:space="preserve">{evaluasi}</w:t>
+              <w:t>{</w:t>
+            </w:r>
+            <w:proofErr w:type="spellStart"/>
+            <w:r>
+              <w:t>evaluasi</w:t>
+            </w:r>
+            <w:proofErr w:type="spellEnd"/>
+            <w:r>
+              <w:t>}</w:t>
             </w:r>
           </w:p>
         </w:tc>
@@ -5263,7 +5612,23 @@
           </w:tcPr>
           <w:p>
             <w:r>
-              <w:t xml:space="preserve">{buku}{/ujian}</w:t>
+              <w:t>{</w:t>
+            </w:r>
+            <w:proofErr w:type="spellStart"/>
+            <w:r>
+              <w:t>buku</w:t>
+            </w:r>
+            <w:proofErr w:type="spellEnd"/>
+            <w:r>
+              <w:t>}{/</w:t>
+            </w:r>
+            <w:proofErr w:type="spellStart"/>
+            <w:r>
+              <w:t>ujian</w:t>
+            </w:r>
+            <w:proofErr w:type="spellEnd"/>
+            <w:r>
+              <w:t>}</w:t>
             </w:r>
           </w:p>
         </w:tc>
@@ -5275,12 +5640,20 @@
         <w:tc>
           <w:tcPr>
             <w:tcW w:w="11433" w:type="dxa"/>
-            <w:gridSpan w:val="5"/>
+            <w:gridSpan w:val="4"/>
             <w:vAlign w:val="center"/>
           </w:tcPr>
           <w:p>
             <w:r>
-              <w:t xml:space="preserve">{#ujian}{label}</w:t>
+              <w:t>{#</w:t>
+            </w:r>
+            <w:proofErr w:type="gramStart"/>
+            <w:r>
+              <w:t>ujian}{</w:t>
+            </w:r>
+            <w:proofErr w:type="gramEnd"/>
+            <w:r>
+              <w:t>label}</w:t>
             </w:r>
           </w:p>
         </w:tc>
@@ -5292,7 +5665,36 @@
           </w:tcPr>
           <w:p>
             <w:r>
-              <w:t xml:space="preserve">{evaluasi}{/ujian}{/rkpbm}</w:t>
+              <w:t>{</w:t>
+            </w:r>
+            <w:proofErr w:type="spellStart"/>
+            <w:r>
+              <w:t>evaluasi</w:t>
+            </w:r>
+            <w:proofErr w:type="spellEnd"/>
+            <w:r>
+              <w:t>}{/</w:t>
+            </w:r>
+            <w:proofErr w:type="spellStart"/>
+            <w:proofErr w:type="gramStart"/>
+            <w:r>
+              <w:t>ujian</w:t>
+            </w:r>
+            <w:proofErr w:type="spellEnd"/>
+            <w:r>
+              <w:t>}{</w:t>
+            </w:r>
+            <w:proofErr w:type="gramEnd"/>
+            <w:r>
+              <w:t>/</w:t>
+            </w:r>
+            <w:proofErr w:type="spellStart"/>
+            <w:r>
+              <w:t>rkpbm</w:t>
+            </w:r>
+            <w:proofErr w:type="spellEnd"/>
+            <w:r>
+              <w:t>}</w:t>
             </w:r>
           </w:p>
         </w:tc>
@@ -5349,13 +5751,27 @@
                 <w:b/>
                 <w:lang w:val="id-ID"/>
               </w:rPr>
-              <w:t xml:space="preserve">PENGESAHAN RPKPS MATA KULIAH </w:t>
+              <w:t xml:space="preserve">PENGESAHAN RPS MATA KULIAH </w:t>
             </w:r>
             <w:r>
               <w:rPr>
                 <w:b/>
               </w:rPr>
-              <w:t xml:space="preserve">{mata_kuliah_upper}</w:t>
+              <w:t>{</w:t>
+            </w:r>
+            <w:proofErr w:type="spellStart"/>
+            <w:r>
+              <w:rPr>
+                <w:b/>
+              </w:rPr>
+              <w:t>mata_kuliah_upper</w:t>
+            </w:r>
+            <w:proofErr w:type="spellEnd"/>
+            <w:r>
+              <w:rPr>
+                <w:b/>
+              </w:rPr>
+              <w:t>}</w:t>
             </w:r>
           </w:p>
           <w:p>
@@ -5366,7 +5782,23 @@
               </w:rPr>
             </w:pPr>
             <w:r>
-              <w:t xml:space="preserve">{kota}, {tanggal}</w:t>
+              <w:t>{</w:t>
+            </w:r>
+            <w:proofErr w:type="spellStart"/>
+            <w:r>
+              <w:t>kota</w:t>
+            </w:r>
+            <w:proofErr w:type="spellEnd"/>
+            <w:r>
+              <w:t>}, {</w:t>
+            </w:r>
+            <w:proofErr w:type="spellStart"/>
+            <w:r>
+              <w:t>tanggal</w:t>
+            </w:r>
+            <w:proofErr w:type="spellEnd"/>
+            <w:r>
+              <w:t>}</w:t>
             </w:r>
           </w:p>
         </w:tc>
@@ -5459,32 +5891,21 @@
               <w:rPr>
                 <w:b/>
               </w:rPr>
-              <w:t xml:space="preserve">{prodi_upper}</w:t>
-            </w:r>
+              <w:t>{</w:t>
+            </w:r>
+            <w:proofErr w:type="spellStart"/>
             <w:r>
               <w:rPr>
                 <w:b/>
-                <w:lang w:val="id-ID"/>
-              </w:rPr>
-              <w:t xml:space="preserve"/>
-            </w:r>
+              </w:rPr>
+              <w:t>prodi_upper</w:t>
+            </w:r>
+            <w:proofErr w:type="spellEnd"/>
             <w:r>
               <w:rPr>
                 <w:b/>
               </w:rPr>
-              <w:t xml:space="preserve"/>
-            </w:r>
-            <w:r>
-              <w:rPr>
-                <w:b/>
-              </w:rPr>
-              <w:t xml:space="preserve"/>
-            </w:r>
-            <w:r>
-              <w:rPr>
-                <w:b/>
-              </w:rPr>
-              <w:t xml:space="preserve"/>
+              <w:t>}</w:t>
             </w:r>
           </w:p>
         </w:tc>
@@ -5518,13 +5939,7 @@
                 <w:b/>
                 <w:lang w:val="id-ID"/>
               </w:rPr>
-              <w:t xml:space="preserve">KETUA JURUSAN {jurusan_upper}</w:t>
-            </w:r>
-            <w:r>
-              <w:rPr>
-                <w:b/>
-              </w:rPr>
-              <w:t xml:space="preserve"/>
+              <w:t>KETUA JURUSAN {jurusan_upper}</w:t>
             </w:r>
           </w:p>
         </w:tc>
@@ -5667,7 +6082,15 @@
               </w:rPr>
             </w:pPr>
             <w:r>
-              <w:t xml:space="preserve">{dosen_utama_nama}</w:t>
+              <w:t>{</w:t>
+            </w:r>
+            <w:proofErr w:type="spellStart"/>
+            <w:r>
+              <w:t>dosen_utama_nama</w:t>
+            </w:r>
+            <w:proofErr w:type="spellEnd"/>
+            <w:r>
+              <w:t>}</w:t>
             </w:r>
           </w:p>
         </w:tc>
@@ -5683,7 +6106,15 @@
               </w:rPr>
             </w:pPr>
             <w:r>
-              <w:t xml:space="preserve">{ka_prodi_nama}</w:t>
+              <w:t>{</w:t>
+            </w:r>
+            <w:proofErr w:type="spellStart"/>
+            <w:r>
+              <w:t>ka_prodi_nama</w:t>
+            </w:r>
+            <w:proofErr w:type="spellEnd"/>
+            <w:r>
+              <w:t>}</w:t>
             </w:r>
           </w:p>
         </w:tc>
@@ -5699,7 +6130,15 @@
               </w:rPr>
             </w:pPr>
             <w:r>
-              <w:t xml:space="preserve">{ketua_jurusan_nama}</w:t>
+              <w:t>{</w:t>
+            </w:r>
+            <w:proofErr w:type="spellStart"/>
+            <w:r>
+              <w:t>ketua_jurusan_nama</w:t>
+            </w:r>
+            <w:proofErr w:type="spellEnd"/>
+            <w:r>
+              <w:t>}</w:t>
             </w:r>
           </w:p>
         </w:tc>
@@ -5718,7 +6157,15 @@
               <w:jc w:val="center"/>
             </w:pPr>
             <w:r>
-              <w:t xml:space="preserve">{dosen_utama_nomor}</w:t>
+              <w:t>{</w:t>
+            </w:r>
+            <w:proofErr w:type="spellStart"/>
+            <w:r>
+              <w:t>dosen_utama_nomor</w:t>
+            </w:r>
+            <w:proofErr w:type="spellEnd"/>
+            <w:r>
+              <w:t>}</w:t>
             </w:r>
           </w:p>
         </w:tc>
@@ -5731,7 +6178,15 @@
               <w:jc w:val="center"/>
             </w:pPr>
             <w:r>
-              <w:t xml:space="preserve">{ka_prodi_nomor}</w:t>
+              <w:t>{</w:t>
+            </w:r>
+            <w:proofErr w:type="spellStart"/>
+            <w:r>
+              <w:t>ka_prodi_nomor</w:t>
+            </w:r>
+            <w:proofErr w:type="spellEnd"/>
+            <w:r>
+              <w:t>}</w:t>
             </w:r>
           </w:p>
         </w:tc>
@@ -5747,7 +6202,15 @@
               </w:rPr>
             </w:pPr>
             <w:r>
-              <w:t xml:space="preserve">{ketua_jurusan_nomor}</w:t>
+              <w:t>{</w:t>
+            </w:r>
+            <w:proofErr w:type="spellStart"/>
+            <w:r>
+              <w:t>ketua_jurusan_nomor</w:t>
+            </w:r>
+            <w:proofErr w:type="spellEnd"/>
+            <w:r>
+              <w:t>}</w:t>
             </w:r>
           </w:p>
         </w:tc>
@@ -5771,7 +6234,7 @@
 </file>
 
 <file path=word/numbering.xml><?xml version="1.0" encoding="utf-8"?>
-<w:numbering xmlns:wpc="http://schemas.microsoft.com/office/word/2010/wordprocessingCanvas" xmlns:cx="http://schemas.microsoft.com/office/drawing/2014/chartex" xmlns:cx1="http://schemas.microsoft.com/office/drawing/2015/9/8/chartex" xmlns:cx2="http://schemas.microsoft.com/office/drawing/2015/10/21/chartex" xmlns:cx3="http://schemas.microsoft.com/office/drawing/2016/5/9/chartex" xmlns:cx4="http://schemas.microsoft.com/office/drawing/2016/5/10/chartex" xmlns:cx5="http://schemas.microsoft.com/office/drawing/2016/5/11/chartex" xmlns:cx6="http://schemas.microsoft.com/office/drawing/2016/5/12/chartex" xmlns:cx7="http://schemas.microsoft.com/office/drawing/2016/5/13/chartex" xmlns:cx8="http://schemas.microsoft.com/office/drawing/2016/5/14/chartex" xmlns:mc="http://schemas.openxmlformats.org/markup-compatibility/2006" xmlns:aink="http://schemas.microsoft.com/office/drawing/2016/ink" xmlns:am3d="http://schemas.microsoft.com/office/drawing/2017/model3d" xmlns:o="urn:schemas-microsoft-com:office:office" xmlns:oel="http://schemas.microsoft.com/office/2019/extlst" xmlns:r="http://schemas.openxmlformats.org/officeDocument/2006/relationships" xmlns:m="http://schemas.openxmlformats.org/officeDocument/2006/math" xmlns:v="urn:schemas-microsoft-com:vml" xmlns:wp14="http://schemas.microsoft.com/office/word/2010/wordprocessingDrawing" xmlns:wp="http://schemas.openxmlformats.org/drawingml/2006/wordprocessingDrawing" xmlns:w10="urn:schemas-microsoft-com:office:word" xmlns:w="http://schemas.openxmlformats.org/wordprocessingml/2006/main" xmlns:w14="http://schemas.microsoft.com/office/word/2010/wordml" xmlns:w15="http://schemas.microsoft.com/office/word/2012/wordml" xmlns:w16cex="http://schemas.microsoft.com/office/word/2018/wordml/cex" xmlns:w16cid="http://schemas.microsoft.com/office/word/2016/wordml/cid" xmlns:w16="http://schemas.microsoft.com/office/word/2018/wordml" xmlns:w16du="http://schemas.microsoft.com/office/word/2023/wordml/word16du" xmlns:w16sdtdh="http://schemas.microsoft.com/office/word/2020/wordml/sdtdatahash" xmlns:w16sdtfl="http://schemas.microsoft.com/office/word/2024/wordml/sdtformatlock" xmlns:w16se="http://schemas.microsoft.com/office/word/2015/wordml/symex" xmlns:wpg="http://schemas.microsoft.com/office/word/2010/wordprocessingGroup" xmlns:wpi="http://schemas.microsoft.com/office/word/2010/wordprocessingInk" xmlns:wne="http://schemas.microsoft.com/office/word/2006/wordml" xmlns:wps="http://schemas.microsoft.com/office/word/2010/wordprocessingShape" mc:Ignorable="w14 w15 w16se w16cid w16 w16cex w16sdtdh w16sdtfl w16du wp14">
+<w:numbering xmlns:wpc="http://schemas.microsoft.com/office/word/2010/wordprocessingCanvas" xmlns:cx="http://schemas.microsoft.com/office/drawing/2014/chartex" xmlns:cx1="http://schemas.microsoft.com/office/drawing/2015/9/8/chartex" xmlns:cx2="http://schemas.microsoft.com/office/drawing/2015/10/21/chartex" xmlns:cx3="http://schemas.microsoft.com/office/drawing/2016/5/9/chartex" xmlns:cx4="http://schemas.microsoft.com/office/drawing/2016/5/10/chartex" xmlns:cx5="http://schemas.microsoft.com/office/drawing/2016/5/11/chartex" xmlns:cx6="http://schemas.microsoft.com/office/drawing/2016/5/12/chartex" xmlns:cx7="http://schemas.microsoft.com/office/drawing/2016/5/13/chartex" xmlns:cx8="http://schemas.microsoft.com/office/drawing/2016/5/14/chartex" xmlns:mc="http://schemas.openxmlformats.org/markup-compatibility/2006" xmlns:aink="http://schemas.microsoft.com/office/drawing/2016/ink" xmlns:am3d="http://schemas.microsoft.com/office/drawing/2017/model3d" xmlns:o="urn:schemas-microsoft-com:office:office" xmlns:oel="http://schemas.microsoft.com/office/2019/extlst" xmlns:r="http://schemas.openxmlformats.org/officeDocument/2006/relationships" xmlns:m="http://schemas.openxmlformats.org/officeDocument/2006/math" xmlns:v="urn:schemas-microsoft-com:vml" xmlns:wp14="http://schemas.microsoft.com/office/word/2010/wordprocessingDrawing" xmlns:wp="http://schemas.openxmlformats.org/drawingml/2006/wordprocessingDrawing" xmlns:w10="urn:schemas-microsoft-com:office:word" xmlns:w="http://schemas.openxmlformats.org/wordprocessingml/2006/main" xmlns:w14="http://schemas.microsoft.com/office/word/2010/wordml" xmlns:w15="http://schemas.microsoft.com/office/word/2012/wordml" xmlns:w16cei="http://schemas.microsoft.com/office/word/2026/wordml/cei" xmlns:w16cex="http://schemas.microsoft.com/office/word/2018/wordml/cex" xmlns:w16cid="http://schemas.microsoft.com/office/word/2016/wordml/cid" xmlns:w16="http://schemas.microsoft.com/office/word/2018/wordml" xmlns:w16du="http://schemas.microsoft.com/office/word/2023/wordml/word16du" xmlns:w16sdtdh="http://schemas.microsoft.com/office/word/2020/wordml/sdtdatahash" xmlns:w16sdtfl="http://schemas.microsoft.com/office/word/2024/wordml/sdtformatlock" xmlns:w16se="http://schemas.microsoft.com/office/word/2015/wordml/symex" xmlns:wpg="http://schemas.microsoft.com/office/word/2010/wordprocessingGroup" xmlns:wpi="http://schemas.microsoft.com/office/word/2010/wordprocessingInk" xmlns:wne="http://schemas.microsoft.com/office/word/2006/wordml" xmlns:wps="http://schemas.microsoft.com/office/word/2010/wordprocessingShape" mc:Ignorable="w14 w15 w16se w16cid w16 w16cex w16sdtdh w16sdtfl w16du wp14">
   <w:abstractNum w:abstractNumId="0" w15:restartNumberingAfterBreak="0">
     <w:nsid w:val="01A826C7"/>
     <w:multiLevelType w:val="hybridMultilevel"/>
@@ -8630,8 +9093,8 @@
   <w:abstractNum w:abstractNumId="29" w15:restartNumberingAfterBreak="0">
     <w:nsid w:val="4DB60A9E"/>
     <w:multiLevelType w:val="hybridMultilevel"/>
-    <w:tmpl w:val="3A1EE9F8"/>
-    <w:lvl w:ilvl="0" w:tplc="4EEE552E">
+    <w:tmpl w:val="DC4AB964"/>
+    <w:lvl w:ilvl="0" w:tplc="B6EE375C">
       <w:start w:val="7"/>
       <w:numFmt w:val="upperLetter"/>
       <w:lvlText w:val="%1."/>
@@ -8640,8 +9103,8 @@
         <w:ind w:left="1080" w:hanging="360"/>
       </w:pPr>
       <w:rPr>
-        <w:b w:val="0"/>
-        <w:bCs/>
+        <w:b/>
+        <w:bCs w:val="0"/>
       </w:rPr>
     </w:lvl>
     <w:lvl w:ilvl="1" w:tplc="5380E8B0">
@@ -9097,6 +9560,98 @@
     </w:lvl>
   </w:abstractNum>
   <w:abstractNum w:abstractNumId="34" w15:restartNumberingAfterBreak="0">
+    <w:nsid w:val="5F795CA0"/>
+    <w:multiLevelType w:val="hybridMultilevel"/>
+    <w:tmpl w:val="E940EA56"/>
+    <w:lvl w:ilvl="0" w:tplc="8832788E">
+      <w:start w:val="1"/>
+      <w:numFmt w:val="lowerLetter"/>
+      <w:lvlText w:val="%1."/>
+      <w:lvlJc w:val="left"/>
+      <w:pPr>
+        <w:ind w:left="720" w:hanging="360"/>
+      </w:pPr>
+      <w:rPr>
+        <w:rFonts w:cs="Times New Roman"/>
+        <w:b/>
+        <w:bCs/>
+        <w:color w:val="auto"/>
+      </w:rPr>
+    </w:lvl>
+    <w:lvl w:ilvl="1" w:tplc="38090019" w:tentative="1">
+      <w:start w:val="1"/>
+      <w:numFmt w:val="lowerLetter"/>
+      <w:lvlText w:val="%2."/>
+      <w:lvlJc w:val="left"/>
+      <w:pPr>
+        <w:ind w:left="1440" w:hanging="360"/>
+      </w:pPr>
+    </w:lvl>
+    <w:lvl w:ilvl="2" w:tplc="3809001B" w:tentative="1">
+      <w:start w:val="1"/>
+      <w:numFmt w:val="lowerRoman"/>
+      <w:lvlText w:val="%3."/>
+      <w:lvlJc w:val="right"/>
+      <w:pPr>
+        <w:ind w:left="2160" w:hanging="180"/>
+      </w:pPr>
+    </w:lvl>
+    <w:lvl w:ilvl="3" w:tplc="3809000F" w:tentative="1">
+      <w:start w:val="1"/>
+      <w:numFmt w:val="decimal"/>
+      <w:lvlText w:val="%4."/>
+      <w:lvlJc w:val="left"/>
+      <w:pPr>
+        <w:ind w:left="2880" w:hanging="360"/>
+      </w:pPr>
+    </w:lvl>
+    <w:lvl w:ilvl="4" w:tplc="38090019" w:tentative="1">
+      <w:start w:val="1"/>
+      <w:numFmt w:val="lowerLetter"/>
+      <w:lvlText w:val="%5."/>
+      <w:lvlJc w:val="left"/>
+      <w:pPr>
+        <w:ind w:left="3600" w:hanging="360"/>
+      </w:pPr>
+    </w:lvl>
+    <w:lvl w:ilvl="5" w:tplc="3809001B" w:tentative="1">
+      <w:start w:val="1"/>
+      <w:numFmt w:val="lowerRoman"/>
+      <w:lvlText w:val="%6."/>
+      <w:lvlJc w:val="right"/>
+      <w:pPr>
+        <w:ind w:left="4320" w:hanging="180"/>
+      </w:pPr>
+    </w:lvl>
+    <w:lvl w:ilvl="6" w:tplc="3809000F" w:tentative="1">
+      <w:start w:val="1"/>
+      <w:numFmt w:val="decimal"/>
+      <w:lvlText w:val="%7."/>
+      <w:lvlJc w:val="left"/>
+      <w:pPr>
+        <w:ind w:left="5040" w:hanging="360"/>
+      </w:pPr>
+    </w:lvl>
+    <w:lvl w:ilvl="7" w:tplc="38090019" w:tentative="1">
+      <w:start w:val="1"/>
+      <w:numFmt w:val="lowerLetter"/>
+      <w:lvlText w:val="%8."/>
+      <w:lvlJc w:val="left"/>
+      <w:pPr>
+        <w:ind w:left="5760" w:hanging="360"/>
+      </w:pPr>
+    </w:lvl>
+    <w:lvl w:ilvl="8" w:tplc="3809001B" w:tentative="1">
+      <w:start w:val="1"/>
+      <w:numFmt w:val="lowerRoman"/>
+      <w:lvlText w:val="%9."/>
+      <w:lvlJc w:val="right"/>
+      <w:pPr>
+        <w:ind w:left="6480" w:hanging="180"/>
+      </w:pPr>
+    </w:lvl>
+  </w:abstractNum>
+  <w:abstractNum w:abstractNumId="35" w15:restartNumberingAfterBreak="0">
     <w:nsid w:val="63877C99"/>
     <w:multiLevelType w:val="hybridMultilevel"/>
     <w:tmpl w:val="96FA9F08"/>
@@ -9185,7 +9740,7 @@
       </w:pPr>
     </w:lvl>
   </w:abstractNum>
-  <w:abstractNum w:abstractNumId="35" w15:restartNumberingAfterBreak="0">
+  <w:abstractNum w:abstractNumId="36" w15:restartNumberingAfterBreak="0">
     <w:nsid w:val="63F90AEC"/>
     <w:multiLevelType w:val="hybridMultilevel"/>
     <w:tmpl w:val="48486532"/>
@@ -9301,7 +9856,7 @@
       </w:pPr>
     </w:lvl>
   </w:abstractNum>
-  <w:abstractNum w:abstractNumId="36" w15:restartNumberingAfterBreak="0">
+  <w:abstractNum w:abstractNumId="37" w15:restartNumberingAfterBreak="0">
     <w:nsid w:val="65D14D5E"/>
     <w:multiLevelType w:val="hybridMultilevel"/>
     <w:tmpl w:val="21BECDA8"/>
@@ -9391,7 +9946,7 @@
       </w:pPr>
     </w:lvl>
   </w:abstractNum>
-  <w:abstractNum w:abstractNumId="37" w15:restartNumberingAfterBreak="0">
+  <w:abstractNum w:abstractNumId="38" w15:restartNumberingAfterBreak="0">
     <w:nsid w:val="67F56A4E"/>
     <w:multiLevelType w:val="hybridMultilevel"/>
     <w:tmpl w:val="DDB63C4C"/>
@@ -9505,7 +10060,7 @@
       </w:rPr>
     </w:lvl>
   </w:abstractNum>
-  <w:abstractNum w:abstractNumId="38" w15:restartNumberingAfterBreak="0">
+  <w:abstractNum w:abstractNumId="39" w15:restartNumberingAfterBreak="0">
     <w:nsid w:val="6F5D0400"/>
     <w:multiLevelType w:val="hybridMultilevel"/>
     <w:tmpl w:val="2FAC1F5C"/>
@@ -9597,7 +10152,7 @@
       </w:pPr>
     </w:lvl>
   </w:abstractNum>
-  <w:abstractNum w:abstractNumId="39" w15:restartNumberingAfterBreak="0">
+  <w:abstractNum w:abstractNumId="40" w15:restartNumberingAfterBreak="0">
     <w:nsid w:val="7DD64CE8"/>
     <w:multiLevelType w:val="hybridMultilevel"/>
     <w:tmpl w:val="5440722A"/>
@@ -9687,7 +10242,7 @@
       </w:pPr>
     </w:lvl>
   </w:abstractNum>
-  <w:abstractNum w:abstractNumId="40" w15:restartNumberingAfterBreak="0">
+  <w:abstractNum w:abstractNumId="41" w15:restartNumberingAfterBreak="0">
     <w:nsid w:val="7F163633"/>
     <w:multiLevelType w:val="hybridMultilevel"/>
     <w:tmpl w:val="200A6484"/>
@@ -9840,7 +10395,7 @@
     <w:abstractNumId w:val="22"/>
   </w:num>
   <w:num w:numId="5" w16cid:durableId="97219787">
-    <w:abstractNumId w:val="38"/>
+    <w:abstractNumId w:val="39"/>
   </w:num>
   <w:num w:numId="6" w16cid:durableId="1865437997">
     <w:abstractNumId w:val="18"/>
@@ -9852,7 +10407,7 @@
     <w:abstractNumId w:val="1"/>
   </w:num>
   <w:num w:numId="9" w16cid:durableId="1914848487">
-    <w:abstractNumId w:val="35"/>
+    <w:abstractNumId w:val="36"/>
   </w:num>
   <w:num w:numId="10" w16cid:durableId="83841010">
     <w:abstractNumId w:val="16"/>
@@ -9867,7 +10422,7 @@
     <w:abstractNumId w:val="15"/>
   </w:num>
   <w:num w:numId="14" w16cid:durableId="1492138837">
-    <w:abstractNumId w:val="34"/>
+    <w:abstractNumId w:val="35"/>
   </w:num>
   <w:num w:numId="15" w16cid:durableId="1833718827">
     <w:abstractNumId w:val="23"/>
@@ -9876,7 +10431,7 @@
     <w:abstractNumId w:val="20"/>
   </w:num>
   <w:num w:numId="17" w16cid:durableId="1664552708">
-    <w:abstractNumId w:val="36"/>
+    <w:abstractNumId w:val="37"/>
   </w:num>
   <w:num w:numId="18" w16cid:durableId="880822420">
     <w:abstractNumId w:val="12"/>
@@ -9885,7 +10440,7 @@
     <w:abstractNumId w:val="9"/>
   </w:num>
   <w:num w:numId="20" w16cid:durableId="1065419602">
-    <w:abstractNumId w:val="37"/>
+    <w:abstractNumId w:val="38"/>
   </w:num>
   <w:num w:numId="21" w16cid:durableId="89203638">
     <w:abstractNumId w:val="19"/>
@@ -9957,7 +10512,7 @@
     <w:abstractNumId w:val="6"/>
   </w:num>
   <w:num w:numId="35" w16cid:durableId="1594895657">
-    <w:abstractNumId w:val="40"/>
+    <w:abstractNumId w:val="41"/>
   </w:num>
   <w:num w:numId="36" w16cid:durableId="896358244">
     <w:abstractNumId w:val="25"/>
@@ -9969,13 +10524,16 @@
     <w:abstractNumId w:val="3"/>
   </w:num>
   <w:num w:numId="39" w16cid:durableId="888806351">
-    <w:abstractNumId w:val="39"/>
+    <w:abstractNumId w:val="40"/>
   </w:num>
   <w:num w:numId="40" w16cid:durableId="488519767">
     <w:abstractNumId w:val="17"/>
   </w:num>
   <w:num w:numId="41" w16cid:durableId="596062488">
     <w:abstractNumId w:val="33"/>
+  </w:num>
+  <w:num w:numId="42" w16cid:durableId="302782917">
+    <w:abstractNumId w:val="34"/>
   </w:num>
   <w:numIdMacAtCleanup w:val="26"/>
 </w:numbering>
@@ -10462,7 +11020,6 @@
     <w:uiPriority w:val="99"/>
     <w:semiHidden/>
     <w:unhideWhenUsed/>
-    <w:qFormat/>
     <w:tblPr>
       <w:tblInd w:w="0" w:type="dxa"/>
       <w:tblCellMar>

</xml_diff>